<commit_message>
Fix Word doc cover page: replace placeholder style-name text with actual title and subtitle
</commit_message>
<xml_diff>
--- a/EAA_Improvement_Summary_Apr2026.docx
+++ b/EAA_Improvement_Summary_Apr2026.docx
@@ -7,7 +7,7 @@
         <w:pStyle w:val="Cover-header"/>
       </w:pPr>
       <w:r>
-        <w:t>Cover-Header</w:t>
+        <w:t>SDG-8612 EAA Compliance</w:t>
       </w:r>
     </w:p>
     <w:p>
@@ -15,13 +15,8 @@
         <w:pStyle w:val="Cover-Subheader"/>
       </w:pPr>
       <w:r>
-        <w:t>Cover-</w:t>
-      </w:r>
-      <w:proofErr w:type="spellStart"/>
-      <w:r>
-        <w:t>Subheader</w:t>
-      </w:r>
-      <w:proofErr w:type="spellEnd"/>
+        <w:t>Improvement Summary</w:t>
+      </w:r>
     </w:p>
     <w:p>
       <w:pPr>

</xml_diff>

<commit_message>
Fix Word doc: rebuild from Adtran template with correct zip ordering and cover page text
Regenerated EAA_Improvement_Summary_Apr2026.docx using the docx skill pack.py
to ensure [Content_Types].xml is the first zip entry (OOXML requirement).
Fixed cover page placeholder text replaced with actual title and subtitle.
All body content preserved: sections 1-4 with status table, implementation
details, remaining work tables, and overall compliance status.
</commit_message>
<xml_diff>
--- a/EAA_Improvement_Summary_Apr2026.docx
+++ b/EAA_Improvement_Summary_Apr2026.docx
@@ -45,41 +45,51 @@
         <w:pStyle w:val="Heading1"/>
       </w:pPr>
       <w:r>
-        <w:t>Status Changes</w:t>
+        <w:t xml:space="preserve">Status Changes</w:t>
       </w:r>
     </w:p>
     <w:tbl>
       <w:tblPr>
-        <w:tblStyle w:val="TableGrid"/>
-        <w:tblW w:w="8734" w:type="dxa"/>
+        <w:tblW w:w="6800" w:type="dxa"/>
         <w:tblBorders>
-          <w:top w:val="single" w:sz="4" w:space="0" w:color="auto"/>
-          <w:left w:val="single" w:sz="4" w:space="0" w:color="auto"/>
-          <w:bottom w:val="single" w:sz="4" w:space="0" w:color="auto"/>
-          <w:right w:val="single" w:sz="4" w:space="0" w:color="auto"/>
-          <w:insideH w:val="single" w:sz="4" w:space="0" w:color="auto"/>
-          <w:insideV w:val="single" w:sz="4" w:space="0" w:color="auto"/>
+          <w:top w:val="single" w:sz="4" w:space="0" w:color="CCCCCC"/>
+          <w:left w:val="single" w:sz="4" w:space="0" w:color="CCCCCC"/>
+          <w:bottom w:val="single" w:sz="4" w:space="0" w:color="CCCCCC"/>
+          <w:right w:val="single" w:sz="4" w:space="0" w:color="CCCCCC"/>
         </w:tblBorders>
-        <w:tblLook w:val="04A0" w:firstRow="1" w:lastRow="0" w:firstColumn="1" w:lastColumn="0" w:noHBand="0" w:noVBand="1"/>
+        <w:tblCellMar>
+          <w:top w:w="80" w:type="dxa"/>
+          <w:start w:w="120" w:type="dxa"/>
+          <w:bottom w:w="80" w:type="dxa"/>
+          <w:end w:w="120" w:type="dxa"/>
+        </w:tblCellMar>
+        <w:tblLook w:val="04A0"/>
       </w:tblPr>
       <w:tblGrid>
-        <w:gridCol w:w="900"/>
-        <w:gridCol w:w="3034"/>
-        <w:gridCol w:w="2400"/>
-        <w:gridCol w:w="2400"/>
+        <w:gridCol w:w="800"/>
+        <w:gridCol w:w="2600"/>
+        <w:gridCol w:w="1700"/>
+        <w:gridCol w:w="1700"/>
       </w:tblGrid>
       <w:tr>
         <w:tc>
           <w:tcPr>
-            <w:tcW w:w="900" w:type="dxa"/>
-          </w:tcPr>
-          <w:p>
-            <w:pPr>
-              <w:pStyle w:val="TableHeader"/>
-              <w:rPr>
-                <w:b/>
-              </w:rPr>
-            </w:pPr>
+            <w:tcW w:w="800" w:type="dxa"/>
+            <w:tcBorders>
+              <w:top w:val="single" w:sz="4" w:space="0" w:color="CCCCCC"/>
+              <w:left w:val="single" w:sz="4" w:space="0" w:color="CCCCCC"/>
+              <w:bottom w:val="single" w:sz="4" w:space="0" w:color="CCCCCC"/>
+              <w:right w:val="single" w:sz="4" w:space="0" w:color="CCCCCC"/>
+            </w:tcBorders>
+            <w:shd w:val="clear" w:color="auto" w:fill="D5E8F0"/>
+            <w:tcMar>
+              <w:top w:w="80" w:type="dxa"/>
+              <w:start w:w="120" w:type="dxa"/>
+              <w:bottom w:w="80" w:type="dxa"/>
+              <w:end w:w="120" w:type="dxa"/>
+            </w:tcMar>
+          </w:tcPr>
+          <w:p>
             <w:r>
               <w:rPr>
                 <w:b/>
@@ -90,15 +100,22 @@
         </w:tc>
         <w:tc>
           <w:tcPr>
-            <w:tcW w:w="3034" w:type="dxa"/>
-          </w:tcPr>
-          <w:p>
-            <w:pPr>
-              <w:pStyle w:val="TableHeader"/>
-              <w:rPr>
-                <w:b/>
-              </w:rPr>
-            </w:pPr>
+            <w:tcW w:w="2600" w:type="dxa"/>
+            <w:tcBorders>
+              <w:top w:val="single" w:sz="4" w:space="0" w:color="CCCCCC"/>
+              <w:left w:val="single" w:sz="4" w:space="0" w:color="CCCCCC"/>
+              <w:bottom w:val="single" w:sz="4" w:space="0" w:color="CCCCCC"/>
+              <w:right w:val="single" w:sz="4" w:space="0" w:color="CCCCCC"/>
+            </w:tcBorders>
+            <w:shd w:val="clear" w:color="auto" w:fill="D5E8F0"/>
+            <w:tcMar>
+              <w:top w:w="80" w:type="dxa"/>
+              <w:start w:w="120" w:type="dxa"/>
+              <w:bottom w:w="80" w:type="dxa"/>
+              <w:end w:w="120" w:type="dxa"/>
+            </w:tcMar>
+          </w:tcPr>
+          <w:p>
             <w:r>
               <w:rPr>
                 <w:b/>
@@ -109,15 +126,22 @@
         </w:tc>
         <w:tc>
           <w:tcPr>
-            <w:tcW w:w="2400" w:type="dxa"/>
-          </w:tcPr>
-          <w:p>
-            <w:pPr>
-              <w:pStyle w:val="TableHeader"/>
-              <w:rPr>
-                <w:b/>
-              </w:rPr>
-            </w:pPr>
+            <w:tcW w:w="1700" w:type="dxa"/>
+            <w:tcBorders>
+              <w:top w:val="single" w:sz="4" w:space="0" w:color="CCCCCC"/>
+              <w:left w:val="single" w:sz="4" w:space="0" w:color="CCCCCC"/>
+              <w:bottom w:val="single" w:sz="4" w:space="0" w:color="CCCCCC"/>
+              <w:right w:val="single" w:sz="4" w:space="0" w:color="CCCCCC"/>
+            </w:tcBorders>
+            <w:shd w:val="clear" w:color="auto" w:fill="D5E8F0"/>
+            <w:tcMar>
+              <w:top w:w="80" w:type="dxa"/>
+              <w:start w:w="120" w:type="dxa"/>
+              <w:bottom w:w="80" w:type="dxa"/>
+              <w:end w:w="120" w:type="dxa"/>
+            </w:tcMar>
+          </w:tcPr>
+          <w:p>
             <w:r>
               <w:rPr>
                 <w:b/>
@@ -128,15 +152,22 @@
         </w:tc>
         <w:tc>
           <w:tcPr>
-            <w:tcW w:w="2400" w:type="dxa"/>
-          </w:tcPr>
-          <w:p>
-            <w:pPr>
-              <w:pStyle w:val="TableHeader"/>
-              <w:rPr>
-                <w:b/>
-              </w:rPr>
-            </w:pPr>
+            <w:tcW w:w="1700" w:type="dxa"/>
+            <w:tcBorders>
+              <w:top w:val="single" w:sz="4" w:space="0" w:color="CCCCCC"/>
+              <w:left w:val="single" w:sz="4" w:space="0" w:color="CCCCCC"/>
+              <w:bottom w:val="single" w:sz="4" w:space="0" w:color="CCCCCC"/>
+              <w:right w:val="single" w:sz="4" w:space="0" w:color="CCCCCC"/>
+            </w:tcBorders>
+            <w:shd w:val="clear" w:color="auto" w:fill="D5E8F0"/>
+            <w:tcMar>
+              <w:top w:w="80" w:type="dxa"/>
+              <w:start w:w="120" w:type="dxa"/>
+              <w:bottom w:w="80" w:type="dxa"/>
+              <w:end w:w="120" w:type="dxa"/>
+            </w:tcMar>
+          </w:tcPr>
+          <w:p>
             <w:r>
               <w:rPr>
                 <w:b/>
@@ -149,12 +180,21 @@
       <w:tr>
         <w:tc>
           <w:tcPr>
-            <w:tcW w:w="900" w:type="dxa"/>
-          </w:tcPr>
-          <w:p>
-            <w:pPr>
-              <w:pStyle w:val="Normal"/>
-            </w:pPr>
+            <w:tcW w:w="800" w:type="dxa"/>
+            <w:tcBorders>
+              <w:top w:val="single" w:sz="4" w:space="0" w:color="CCCCCC"/>
+              <w:left w:val="single" w:sz="4" w:space="0" w:color="CCCCCC"/>
+              <w:bottom w:val="single" w:sz="4" w:space="0" w:color="CCCCCC"/>
+              <w:right w:val="single" w:sz="4" w:space="0" w:color="CCCCCC"/>
+            </w:tcBorders>
+            <w:tcMar>
+              <w:top w:w="80" w:type="dxa"/>
+              <w:start w:w="120" w:type="dxa"/>
+              <w:bottom w:w="80" w:type="dxa"/>
+              <w:end w:w="120" w:type="dxa"/>
+            </w:tcMar>
+          </w:tcPr>
+          <w:p>
             <w:r>
               <w:t xml:space="preserve">C.1</w:t>
             </w:r>
@@ -162,12 +202,21 @@
         </w:tc>
         <w:tc>
           <w:tcPr>
-            <w:tcW w:w="3034" w:type="dxa"/>
-          </w:tcPr>
-          <w:p>
-            <w:pPr>
-              <w:pStyle w:val="Normal"/>
-            </w:pPr>
+            <w:tcW w:w="2600" w:type="dxa"/>
+            <w:tcBorders>
+              <w:top w:val="single" w:sz="4" w:space="0" w:color="CCCCCC"/>
+              <w:left w:val="single" w:sz="4" w:space="0" w:color="CCCCCC"/>
+              <w:bottom w:val="single" w:sz="4" w:space="0" w:color="CCCCCC"/>
+              <w:right w:val="single" w:sz="4" w:space="0" w:color="CCCCCC"/>
+            </w:tcBorders>
+            <w:tcMar>
+              <w:top w:w="80" w:type="dxa"/>
+              <w:start w:w="120" w:type="dxa"/>
+              <w:bottom w:w="80" w:type="dxa"/>
+              <w:end w:w="120" w:type="dxa"/>
+            </w:tcMar>
+          </w:tcPr>
+          <w:p>
             <w:r>
               <w:t xml:space="preserve">Screen reader compatibility</w:t>
             </w:r>
@@ -175,12 +224,21 @@
         </w:tc>
         <w:tc>
           <w:tcPr>
-            <w:tcW w:w="2400" w:type="dxa"/>
-          </w:tcPr>
-          <w:p>
-            <w:pPr>
-              <w:pStyle w:val="Normal"/>
-            </w:pPr>
+            <w:tcW w:w="1700" w:type="dxa"/>
+            <w:tcBorders>
+              <w:top w:val="single" w:sz="4" w:space="0" w:color="CCCCCC"/>
+              <w:left w:val="single" w:sz="4" w:space="0" w:color="CCCCCC"/>
+              <w:bottom w:val="single" w:sz="4" w:space="0" w:color="CCCCCC"/>
+              <w:right w:val="single" w:sz="4" w:space="0" w:color="CCCCCC"/>
+            </w:tcBorders>
+            <w:tcMar>
+              <w:top w:w="80" w:type="dxa"/>
+              <w:start w:w="120" w:type="dxa"/>
+              <w:bottom w:w="80" w:type="dxa"/>
+              <w:end w:w="120" w:type="dxa"/>
+            </w:tcMar>
+          </w:tcPr>
+          <w:p>
             <w:r>
               <w:t xml:space="preserve">CANNOT ASSESS</w:t>
             </w:r>
@@ -188,12 +246,21 @@
         </w:tc>
         <w:tc>
           <w:tcPr>
-            <w:tcW w:w="2400" w:type="dxa"/>
-          </w:tcPr>
-          <w:p>
-            <w:pPr>
-              <w:pStyle w:val="Normal"/>
-            </w:pPr>
+            <w:tcW w:w="1700" w:type="dxa"/>
+            <w:tcBorders>
+              <w:top w:val="single" w:sz="4" w:space="0" w:color="CCCCCC"/>
+              <w:left w:val="single" w:sz="4" w:space="0" w:color="CCCCCC"/>
+              <w:bottom w:val="single" w:sz="4" w:space="0" w:color="CCCCCC"/>
+              <w:right w:val="single" w:sz="4" w:space="0" w:color="CCCCCC"/>
+            </w:tcBorders>
+            <w:tcMar>
+              <w:top w:w="80" w:type="dxa"/>
+              <w:start w:w="120" w:type="dxa"/>
+              <w:bottom w:w="80" w:type="dxa"/>
+              <w:end w:w="120" w:type="dxa"/>
+            </w:tcMar>
+          </w:tcPr>
+          <w:p>
             <w:r>
               <w:t xml:space="preserve">PARTIALLY MET</w:t>
             </w:r>
@@ -203,12 +270,21 @@
       <w:tr>
         <w:tc>
           <w:tcPr>
-            <w:tcW w:w="900" w:type="dxa"/>
-          </w:tcPr>
-          <w:p>
-            <w:pPr>
-              <w:pStyle w:val="Normal"/>
-            </w:pPr>
+            <w:tcW w:w="800" w:type="dxa"/>
+            <w:tcBorders>
+              <w:top w:val="single" w:sz="4" w:space="0" w:color="CCCCCC"/>
+              <w:left w:val="single" w:sz="4" w:space="0" w:color="CCCCCC"/>
+              <w:bottom w:val="single" w:sz="4" w:space="0" w:color="CCCCCC"/>
+              <w:right w:val="single" w:sz="4" w:space="0" w:color="CCCCCC"/>
+            </w:tcBorders>
+            <w:tcMar>
+              <w:top w:w="80" w:type="dxa"/>
+              <w:start w:w="120" w:type="dxa"/>
+              <w:bottom w:w="80" w:type="dxa"/>
+              <w:end w:w="120" w:type="dxa"/>
+            </w:tcMar>
+          </w:tcPr>
+          <w:p>
             <w:r>
               <w:t xml:space="preserve">C.2</w:t>
             </w:r>
@@ -216,12 +292,21 @@
         </w:tc>
         <w:tc>
           <w:tcPr>
-            <w:tcW w:w="3034" w:type="dxa"/>
-          </w:tcPr>
-          <w:p>
-            <w:pPr>
-              <w:pStyle w:val="Normal"/>
-            </w:pPr>
+            <w:tcW w:w="2600" w:type="dxa"/>
+            <w:tcBorders>
+              <w:top w:val="single" w:sz="4" w:space="0" w:color="CCCCCC"/>
+              <w:left w:val="single" w:sz="4" w:space="0" w:color="CCCCCC"/>
+              <w:bottom w:val="single" w:sz="4" w:space="0" w:color="CCCCCC"/>
+              <w:right w:val="single" w:sz="4" w:space="0" w:color="CCCCCC"/>
+            </w:tcBorders>
+            <w:tcMar>
+              <w:top w:w="80" w:type="dxa"/>
+              <w:start w:w="120" w:type="dxa"/>
+              <w:bottom w:w="80" w:type="dxa"/>
+              <w:end w:w="120" w:type="dxa"/>
+            </w:tcMar>
+          </w:tcPr>
+          <w:p>
             <w:r>
               <w:t xml:space="preserve">Multi-sensory UI feedback</w:t>
             </w:r>
@@ -229,12 +314,21 @@
         </w:tc>
         <w:tc>
           <w:tcPr>
-            <w:tcW w:w="2400" w:type="dxa"/>
-          </w:tcPr>
-          <w:p>
-            <w:pPr>
-              <w:pStyle w:val="Normal"/>
-            </w:pPr>
+            <w:tcW w:w="1700" w:type="dxa"/>
+            <w:tcBorders>
+              <w:top w:val="single" w:sz="4" w:space="0" w:color="CCCCCC"/>
+              <w:left w:val="single" w:sz="4" w:space="0" w:color="CCCCCC"/>
+              <w:bottom w:val="single" w:sz="4" w:space="0" w:color="CCCCCC"/>
+              <w:right w:val="single" w:sz="4" w:space="0" w:color="CCCCCC"/>
+            </w:tcBorders>
+            <w:tcMar>
+              <w:top w:w="80" w:type="dxa"/>
+              <w:start w:w="120" w:type="dxa"/>
+              <w:bottom w:w="80" w:type="dxa"/>
+              <w:end w:w="120" w:type="dxa"/>
+            </w:tcMar>
+          </w:tcPr>
+          <w:p>
             <w:r>
               <w:t xml:space="preserve">LIKELY GAP</w:t>
             </w:r>
@@ -242,12 +336,21 @@
         </w:tc>
         <w:tc>
           <w:tcPr>
-            <w:tcW w:w="2400" w:type="dxa"/>
-          </w:tcPr>
-          <w:p>
-            <w:pPr>
-              <w:pStyle w:val="Normal"/>
-            </w:pPr>
+            <w:tcW w:w="1700" w:type="dxa"/>
+            <w:tcBorders>
+              <w:top w:val="single" w:sz="4" w:space="0" w:color="CCCCCC"/>
+              <w:left w:val="single" w:sz="4" w:space="0" w:color="CCCCCC"/>
+              <w:bottom w:val="single" w:sz="4" w:space="0" w:color="CCCCCC"/>
+              <w:right w:val="single" w:sz="4" w:space="0" w:color="CCCCCC"/>
+            </w:tcBorders>
+            <w:tcMar>
+              <w:top w:w="80" w:type="dxa"/>
+              <w:start w:w="120" w:type="dxa"/>
+              <w:bottom w:w="80" w:type="dxa"/>
+              <w:end w:w="120" w:type="dxa"/>
+            </w:tcMar>
+          </w:tcPr>
+          <w:p>
             <w:r>
               <w:t xml:space="preserve">PARTIALLY MET</w:t>
             </w:r>
@@ -257,12 +360,21 @@
       <w:tr>
         <w:tc>
           <w:tcPr>
-            <w:tcW w:w="900" w:type="dxa"/>
-          </w:tcPr>
-          <w:p>
-            <w:pPr>
-              <w:pStyle w:val="Normal"/>
-            </w:pPr>
+            <w:tcW w:w="800" w:type="dxa"/>
+            <w:tcBorders>
+              <w:top w:val="single" w:sz="4" w:space="0" w:color="CCCCCC"/>
+              <w:left w:val="single" w:sz="4" w:space="0" w:color="CCCCCC"/>
+              <w:bottom w:val="single" w:sz="4" w:space="0" w:color="CCCCCC"/>
+              <w:right w:val="single" w:sz="4" w:space="0" w:color="CCCCCC"/>
+            </w:tcBorders>
+            <w:tcMar>
+              <w:top w:w="80" w:type="dxa"/>
+              <w:start w:w="120" w:type="dxa"/>
+              <w:bottom w:w="80" w:type="dxa"/>
+              <w:end w:w="120" w:type="dxa"/>
+            </w:tcMar>
+          </w:tcPr>
+          <w:p>
             <w:r>
               <w:t xml:space="preserve">C.3</w:t>
             </w:r>
@@ -270,12 +382,21 @@
         </w:tc>
         <w:tc>
           <w:tcPr>
-            <w:tcW w:w="3034" w:type="dxa"/>
-          </w:tcPr>
-          <w:p>
-            <w:pPr>
-              <w:pStyle w:val="Normal"/>
-            </w:pPr>
+            <w:tcW w:w="2600" w:type="dxa"/>
+            <w:tcBorders>
+              <w:top w:val="single" w:sz="4" w:space="0" w:color="CCCCCC"/>
+              <w:left w:val="single" w:sz="4" w:space="0" w:color="CCCCCC"/>
+              <w:bottom w:val="single" w:sz="4" w:space="0" w:color="CCCCCC"/>
+              <w:right w:val="single" w:sz="4" w:space="0" w:color="CCCCCC"/>
+            </w:tcBorders>
+            <w:tcMar>
+              <w:top w:w="80" w:type="dxa"/>
+              <w:start w:w="120" w:type="dxa"/>
+              <w:bottom w:w="80" w:type="dxa"/>
+              <w:end w:w="120" w:type="dxa"/>
+            </w:tcMar>
+          </w:tcPr>
+          <w:p>
             <w:r>
               <w:t xml:space="preserve">Keyboard-only operation</w:t>
             </w:r>
@@ -283,12 +404,21 @@
         </w:tc>
         <w:tc>
           <w:tcPr>
-            <w:tcW w:w="2400" w:type="dxa"/>
-          </w:tcPr>
-          <w:p>
-            <w:pPr>
-              <w:pStyle w:val="Normal"/>
-            </w:pPr>
+            <w:tcW w:w="1700" w:type="dxa"/>
+            <w:tcBorders>
+              <w:top w:val="single" w:sz="4" w:space="0" w:color="CCCCCC"/>
+              <w:left w:val="single" w:sz="4" w:space="0" w:color="CCCCCC"/>
+              <w:bottom w:val="single" w:sz="4" w:space="0" w:color="CCCCCC"/>
+              <w:right w:val="single" w:sz="4" w:space="0" w:color="CCCCCC"/>
+            </w:tcBorders>
+            <w:tcMar>
+              <w:top w:w="80" w:type="dxa"/>
+              <w:start w:w="120" w:type="dxa"/>
+              <w:bottom w:w="80" w:type="dxa"/>
+              <w:end w:w="120" w:type="dxa"/>
+            </w:tcMar>
+          </w:tcPr>
+          <w:p>
             <w:r>
               <w:t xml:space="preserve">LIKELY MET</w:t>
             </w:r>
@@ -296,12 +426,21 @@
         </w:tc>
         <w:tc>
           <w:tcPr>
-            <w:tcW w:w="2400" w:type="dxa"/>
-          </w:tcPr>
-          <w:p>
-            <w:pPr>
-              <w:pStyle w:val="Normal"/>
-            </w:pPr>
+            <w:tcW w:w="1700" w:type="dxa"/>
+            <w:tcBorders>
+              <w:top w:val="single" w:sz="4" w:space="0" w:color="CCCCCC"/>
+              <w:left w:val="single" w:sz="4" w:space="0" w:color="CCCCCC"/>
+              <w:bottom w:val="single" w:sz="4" w:space="0" w:color="CCCCCC"/>
+              <w:right w:val="single" w:sz="4" w:space="0" w:color="CCCCCC"/>
+            </w:tcBorders>
+            <w:tcMar>
+              <w:top w:w="80" w:type="dxa"/>
+              <w:start w:w="120" w:type="dxa"/>
+              <w:bottom w:w="80" w:type="dxa"/>
+              <w:end w:w="120" w:type="dxa"/>
+            </w:tcMar>
+          </w:tcPr>
+          <w:p>
             <w:r>
               <w:t xml:space="preserve">LIKELY MET (confirmed)</w:t>
             </w:r>
@@ -311,12 +450,21 @@
       <w:tr>
         <w:tc>
           <w:tcPr>
-            <w:tcW w:w="900" w:type="dxa"/>
-          </w:tcPr>
-          <w:p>
-            <w:pPr>
-              <w:pStyle w:val="Normal"/>
-            </w:pPr>
+            <w:tcW w:w="800" w:type="dxa"/>
+            <w:tcBorders>
+              <w:top w:val="single" w:sz="4" w:space="0" w:color="CCCCCC"/>
+              <w:left w:val="single" w:sz="4" w:space="0" w:color="CCCCCC"/>
+              <w:bottom w:val="single" w:sz="4" w:space="0" w:color="CCCCCC"/>
+              <w:right w:val="single" w:sz="4" w:space="0" w:color="CCCCCC"/>
+            </w:tcBorders>
+            <w:tcMar>
+              <w:top w:w="80" w:type="dxa"/>
+              <w:start w:w="120" w:type="dxa"/>
+              <w:bottom w:w="80" w:type="dxa"/>
+              <w:end w:w="120" w:type="dxa"/>
+            </w:tcMar>
+          </w:tcPr>
+          <w:p>
             <w:r>
               <w:t xml:space="preserve">C.4</w:t>
             </w:r>
@@ -324,12 +472,21 @@
         </w:tc>
         <w:tc>
           <w:tcPr>
-            <w:tcW w:w="3034" w:type="dxa"/>
-          </w:tcPr>
-          <w:p>
-            <w:pPr>
-              <w:pStyle w:val="Normal"/>
-            </w:pPr>
+            <w:tcW w:w="2600" w:type="dxa"/>
+            <w:tcBorders>
+              <w:top w:val="single" w:sz="4" w:space="0" w:color="CCCCCC"/>
+              <w:left w:val="single" w:sz="4" w:space="0" w:color="CCCCCC"/>
+              <w:bottom w:val="single" w:sz="4" w:space="0" w:color="CCCCCC"/>
+              <w:right w:val="single" w:sz="4" w:space="0" w:color="CCCCCC"/>
+            </w:tcBorders>
+            <w:tcMar>
+              <w:top w:w="80" w:type="dxa"/>
+              <w:start w:w="120" w:type="dxa"/>
+              <w:bottom w:w="80" w:type="dxa"/>
+              <w:end w:w="120" w:type="dxa"/>
+            </w:tcMar>
+          </w:tcPr>
+          <w:p>
             <w:r>
               <w:t xml:space="preserve">WCAG contrast and magnification</w:t>
             </w:r>
@@ -337,12 +494,21 @@
         </w:tc>
         <w:tc>
           <w:tcPr>
-            <w:tcW w:w="2400" w:type="dxa"/>
-          </w:tcPr>
-          <w:p>
-            <w:pPr>
-              <w:pStyle w:val="Normal"/>
-            </w:pPr>
+            <w:tcW w:w="1700" w:type="dxa"/>
+            <w:tcBorders>
+              <w:top w:val="single" w:sz="4" w:space="0" w:color="CCCCCC"/>
+              <w:left w:val="single" w:sz="4" w:space="0" w:color="CCCCCC"/>
+              <w:bottom w:val="single" w:sz="4" w:space="0" w:color="CCCCCC"/>
+              <w:right w:val="single" w:sz="4" w:space="0" w:color="CCCCCC"/>
+            </w:tcBorders>
+            <w:tcMar>
+              <w:top w:w="80" w:type="dxa"/>
+              <w:start w:w="120" w:type="dxa"/>
+              <w:bottom w:w="80" w:type="dxa"/>
+              <w:end w:w="120" w:type="dxa"/>
+            </w:tcMar>
+          </w:tcPr>
+          <w:p>
             <w:r>
               <w:t xml:space="preserve">CANNOT ASSESS</w:t>
             </w:r>
@@ -350,12 +516,21 @@
         </w:tc>
         <w:tc>
           <w:tcPr>
-            <w:tcW w:w="2400" w:type="dxa"/>
-          </w:tcPr>
-          <w:p>
-            <w:pPr>
-              <w:pStyle w:val="Normal"/>
-            </w:pPr>
+            <w:tcW w:w="1700" w:type="dxa"/>
+            <w:tcBorders>
+              <w:top w:val="single" w:sz="4" w:space="0" w:color="CCCCCC"/>
+              <w:left w:val="single" w:sz="4" w:space="0" w:color="CCCCCC"/>
+              <w:bottom w:val="single" w:sz="4" w:space="0" w:color="CCCCCC"/>
+              <w:right w:val="single" w:sz="4" w:space="0" w:color="CCCCCC"/>
+            </w:tcBorders>
+            <w:tcMar>
+              <w:top w:w="80" w:type="dxa"/>
+              <w:start w:w="120" w:type="dxa"/>
+              <w:bottom w:w="80" w:type="dxa"/>
+              <w:end w:w="120" w:type="dxa"/>
+            </w:tcMar>
+          </w:tcPr>
+          <w:p>
             <w:r>
               <w:t xml:space="preserve">PARTIALLY MET</w:t>
             </w:r>
@@ -365,12 +540,21 @@
       <w:tr>
         <w:tc>
           <w:tcPr>
-            <w:tcW w:w="900" w:type="dxa"/>
-          </w:tcPr>
-          <w:p>
-            <w:pPr>
-              <w:pStyle w:val="Normal"/>
-            </w:pPr>
+            <w:tcW w:w="800" w:type="dxa"/>
+            <w:tcBorders>
+              <w:top w:val="single" w:sz="4" w:space="0" w:color="CCCCCC"/>
+              <w:left w:val="single" w:sz="4" w:space="0" w:color="CCCCCC"/>
+              <w:bottom w:val="single" w:sz="4" w:space="0" w:color="CCCCCC"/>
+              <w:right w:val="single" w:sz="4" w:space="0" w:color="CCCCCC"/>
+            </w:tcBorders>
+            <w:tcMar>
+              <w:top w:w="80" w:type="dxa"/>
+              <w:start w:w="120" w:type="dxa"/>
+              <w:bottom w:w="80" w:type="dxa"/>
+              <w:end w:w="120" w:type="dxa"/>
+            </w:tcMar>
+          </w:tcPr>
+          <w:p>
             <w:r>
               <w:t xml:space="preserve">C.5</w:t>
             </w:r>
@@ -378,12 +562,21 @@
         </w:tc>
         <w:tc>
           <w:tcPr>
-            <w:tcW w:w="3034" w:type="dxa"/>
-          </w:tcPr>
-          <w:p>
-            <w:pPr>
-              <w:pStyle w:val="Normal"/>
-            </w:pPr>
+            <w:tcW w:w="2600" w:type="dxa"/>
+            <w:tcBorders>
+              <w:top w:val="single" w:sz="4" w:space="0" w:color="CCCCCC"/>
+              <w:left w:val="single" w:sz="4" w:space="0" w:color="CCCCCC"/>
+              <w:bottom w:val="single" w:sz="4" w:space="0" w:color="CCCCCC"/>
+              <w:right w:val="single" w:sz="4" w:space="0" w:color="CCCCCC"/>
+            </w:tcBorders>
+            <w:tcMar>
+              <w:top w:w="80" w:type="dxa"/>
+              <w:start w:w="120" w:type="dxa"/>
+              <w:bottom w:w="80" w:type="dxa"/>
+              <w:end w:w="120" w:type="dxa"/>
+            </w:tcMar>
+          </w:tcPr>
+          <w:p>
             <w:r>
               <w:t xml:space="preserve">Non-color UI indicators</w:t>
             </w:r>
@@ -391,12 +584,21 @@
         </w:tc>
         <w:tc>
           <w:tcPr>
-            <w:tcW w:w="2400" w:type="dxa"/>
-          </w:tcPr>
-          <w:p>
-            <w:pPr>
-              <w:pStyle w:val="Normal"/>
-            </w:pPr>
+            <w:tcW w:w="1700" w:type="dxa"/>
+            <w:tcBorders>
+              <w:top w:val="single" w:sz="4" w:space="0" w:color="CCCCCC"/>
+              <w:left w:val="single" w:sz="4" w:space="0" w:color="CCCCCC"/>
+              <w:bottom w:val="single" w:sz="4" w:space="0" w:color="CCCCCC"/>
+              <w:right w:val="single" w:sz="4" w:space="0" w:color="CCCCCC"/>
+            </w:tcBorders>
+            <w:tcMar>
+              <w:top w:w="80" w:type="dxa"/>
+              <w:start w:w="120" w:type="dxa"/>
+              <w:bottom w:w="80" w:type="dxa"/>
+              <w:end w:w="120" w:type="dxa"/>
+            </w:tcMar>
+          </w:tcPr>
+          <w:p>
             <w:r>
               <w:t xml:space="preserve">LIKELY GAP</w:t>
             </w:r>
@@ -404,12 +606,21 @@
         </w:tc>
         <w:tc>
           <w:tcPr>
-            <w:tcW w:w="2400" w:type="dxa"/>
-          </w:tcPr>
-          <w:p>
-            <w:pPr>
-              <w:pStyle w:val="Normal"/>
-            </w:pPr>
+            <w:tcW w:w="1700" w:type="dxa"/>
+            <w:tcBorders>
+              <w:top w:val="single" w:sz="4" w:space="0" w:color="CCCCCC"/>
+              <w:left w:val="single" w:sz="4" w:space="0" w:color="CCCCCC"/>
+              <w:bottom w:val="single" w:sz="4" w:space="0" w:color="CCCCCC"/>
+              <w:right w:val="single" w:sz="4" w:space="0" w:color="CCCCCC"/>
+            </w:tcBorders>
+            <w:tcMar>
+              <w:top w:w="80" w:type="dxa"/>
+              <w:start w:w="120" w:type="dxa"/>
+              <w:bottom w:w="80" w:type="dxa"/>
+              <w:end w:w="120" w:type="dxa"/>
+            </w:tcMar>
+          </w:tcPr>
+          <w:p>
             <w:r>
               <w:t xml:space="preserve">PARTIALLY MET (extended)</w:t>
             </w:r>
@@ -419,12 +630,21 @@
       <w:tr>
         <w:tc>
           <w:tcPr>
-            <w:tcW w:w="900" w:type="dxa"/>
-          </w:tcPr>
-          <w:p>
-            <w:pPr>
-              <w:pStyle w:val="Normal"/>
-            </w:pPr>
+            <w:tcW w:w="800" w:type="dxa"/>
+            <w:tcBorders>
+              <w:top w:val="single" w:sz="4" w:space="0" w:color="CCCCCC"/>
+              <w:left w:val="single" w:sz="4" w:space="0" w:color="CCCCCC"/>
+              <w:bottom w:val="single" w:sz="4" w:space="0" w:color="CCCCCC"/>
+              <w:right w:val="single" w:sz="4" w:space="0" w:color="CCCCCC"/>
+            </w:tcBorders>
+            <w:tcMar>
+              <w:top w:w="80" w:type="dxa"/>
+              <w:start w:w="120" w:type="dxa"/>
+              <w:bottom w:w="80" w:type="dxa"/>
+              <w:end w:w="120" w:type="dxa"/>
+            </w:tcMar>
+          </w:tcPr>
+          <w:p>
             <w:r>
               <w:t xml:space="preserve">C.7</w:t>
             </w:r>
@@ -432,12 +652,21 @@
         </w:tc>
         <w:tc>
           <w:tcPr>
-            <w:tcW w:w="3034" w:type="dxa"/>
-          </w:tcPr>
-          <w:p>
-            <w:pPr>
-              <w:pStyle w:val="Normal"/>
-            </w:pPr>
+            <w:tcW w:w="2600" w:type="dxa"/>
+            <w:tcBorders>
+              <w:top w:val="single" w:sz="4" w:space="0" w:color="CCCCCC"/>
+              <w:left w:val="single" w:sz="4" w:space="0" w:color="CCCCCC"/>
+              <w:bottom w:val="single" w:sz="4" w:space="0" w:color="CCCCCC"/>
+              <w:right w:val="single" w:sz="4" w:space="0" w:color="CCCCCC"/>
+            </w:tcBorders>
+            <w:tcMar>
+              <w:top w:w="80" w:type="dxa"/>
+              <w:start w:w="120" w:type="dxa"/>
+              <w:bottom w:w="80" w:type="dxa"/>
+              <w:end w:w="120" w:type="dxa"/>
+            </w:tcMar>
+          </w:tcPr>
+          <w:p>
             <w:r>
               <w:t xml:space="preserve">Visual clarity / High Contrast</w:t>
             </w:r>
@@ -445,12 +674,21 @@
         </w:tc>
         <w:tc>
           <w:tcPr>
-            <w:tcW w:w="2400" w:type="dxa"/>
-          </w:tcPr>
-          <w:p>
-            <w:pPr>
-              <w:pStyle w:val="Normal"/>
-            </w:pPr>
+            <w:tcW w:w="1700" w:type="dxa"/>
+            <w:tcBorders>
+              <w:top w:val="single" w:sz="4" w:space="0" w:color="CCCCCC"/>
+              <w:left w:val="single" w:sz="4" w:space="0" w:color="CCCCCC"/>
+              <w:bottom w:val="single" w:sz="4" w:space="0" w:color="CCCCCC"/>
+              <w:right w:val="single" w:sz="4" w:space="0" w:color="CCCCCC"/>
+            </w:tcBorders>
+            <w:tcMar>
+              <w:top w:w="80" w:type="dxa"/>
+              <w:start w:w="120" w:type="dxa"/>
+              <w:bottom w:w="80" w:type="dxa"/>
+              <w:end w:w="120" w:type="dxa"/>
+            </w:tcMar>
+          </w:tcPr>
+          <w:p>
             <w:r>
               <w:t xml:space="preserve">PARTIALLY MET</w:t>
             </w:r>
@@ -458,12 +696,21 @@
         </w:tc>
         <w:tc>
           <w:tcPr>
-            <w:tcW w:w="2400" w:type="dxa"/>
-          </w:tcPr>
-          <w:p>
-            <w:pPr>
-              <w:pStyle w:val="Normal"/>
-            </w:pPr>
+            <w:tcW w:w="1700" w:type="dxa"/>
+            <w:tcBorders>
+              <w:top w:val="single" w:sz="4" w:space="0" w:color="CCCCCC"/>
+              <w:left w:val="single" w:sz="4" w:space="0" w:color="CCCCCC"/>
+              <w:bottom w:val="single" w:sz="4" w:space="0" w:color="CCCCCC"/>
+              <w:right w:val="single" w:sz="4" w:space="0" w:color="CCCCCC"/>
+            </w:tcBorders>
+            <w:tcMar>
+              <w:top w:w="80" w:type="dxa"/>
+              <w:start w:w="120" w:type="dxa"/>
+              <w:bottom w:w="80" w:type="dxa"/>
+              <w:end w:w="120" w:type="dxa"/>
+            </w:tcMar>
+          </w:tcPr>
+          <w:p>
             <w:r>
               <w:t xml:space="preserve">PARTIALLY MET (extended)</w:t>
             </w:r>
@@ -473,12 +720,21 @@
       <w:tr>
         <w:tc>
           <w:tcPr>
-            <w:tcW w:w="900" w:type="dxa"/>
-          </w:tcPr>
-          <w:p>
-            <w:pPr>
-              <w:pStyle w:val="Normal"/>
-            </w:pPr>
+            <w:tcW w:w="800" w:type="dxa"/>
+            <w:tcBorders>
+              <w:top w:val="single" w:sz="4" w:space="0" w:color="CCCCCC"/>
+              <w:left w:val="single" w:sz="4" w:space="0" w:color="CCCCCC"/>
+              <w:bottom w:val="single" w:sz="4" w:space="0" w:color="CCCCCC"/>
+              <w:right w:val="single" w:sz="4" w:space="0" w:color="CCCCCC"/>
+            </w:tcBorders>
+            <w:tcMar>
+              <w:top w:w="80" w:type="dxa"/>
+              <w:start w:w="120" w:type="dxa"/>
+              <w:bottom w:w="80" w:type="dxa"/>
+              <w:end w:w="120" w:type="dxa"/>
+            </w:tcMar>
+          </w:tcPr>
+          <w:p>
             <w:r>
               <w:t xml:space="preserve">C.14</w:t>
             </w:r>
@@ -486,12 +742,21 @@
         </w:tc>
         <w:tc>
           <w:tcPr>
-            <w:tcW w:w="3034" w:type="dxa"/>
-          </w:tcPr>
-          <w:p>
-            <w:pPr>
-              <w:pStyle w:val="Normal"/>
-            </w:pPr>
+            <w:tcW w:w="2600" w:type="dxa"/>
+            <w:tcBorders>
+              <w:top w:val="single" w:sz="4" w:space="0" w:color="CCCCCC"/>
+              <w:left w:val="single" w:sz="4" w:space="0" w:color="CCCCCC"/>
+              <w:bottom w:val="single" w:sz="4" w:space="0" w:color="CCCCCC"/>
+              <w:right w:val="single" w:sz="4" w:space="0" w:color="CCCCCC"/>
+            </w:tcBorders>
+            <w:tcMar>
+              <w:top w:w="80" w:type="dxa"/>
+              <w:start w:w="120" w:type="dxa"/>
+              <w:bottom w:w="80" w:type="dxa"/>
+              <w:end w:w="120" w:type="dxa"/>
+            </w:tcMar>
+          </w:tcPr>
+          <w:p>
             <w:r>
               <w:t xml:space="preserve">Assistive technology APIs</w:t>
             </w:r>
@@ -499,12 +764,21 @@
         </w:tc>
         <w:tc>
           <w:tcPr>
-            <w:tcW w:w="2400" w:type="dxa"/>
-          </w:tcPr>
-          <w:p>
-            <w:pPr>
-              <w:pStyle w:val="Normal"/>
-            </w:pPr>
+            <w:tcW w:w="1700" w:type="dxa"/>
+            <w:tcBorders>
+              <w:top w:val="single" w:sz="4" w:space="0" w:color="CCCCCC"/>
+              <w:left w:val="single" w:sz="4" w:space="0" w:color="CCCCCC"/>
+              <w:bottom w:val="single" w:sz="4" w:space="0" w:color="CCCCCC"/>
+              <w:right w:val="single" w:sz="4" w:space="0" w:color="CCCCCC"/>
+            </w:tcBorders>
+            <w:tcMar>
+              <w:top w:w="80" w:type="dxa"/>
+              <w:start w:w="120" w:type="dxa"/>
+              <w:bottom w:w="80" w:type="dxa"/>
+              <w:end w:w="120" w:type="dxa"/>
+            </w:tcMar>
+          </w:tcPr>
+          <w:p>
             <w:r>
               <w:t xml:space="preserve">CANNOT ASSESS</w:t>
             </w:r>
@@ -512,12 +786,21 @@
         </w:tc>
         <w:tc>
           <w:tcPr>
-            <w:tcW w:w="2400" w:type="dxa"/>
-          </w:tcPr>
-          <w:p>
-            <w:pPr>
-              <w:pStyle w:val="Normal"/>
-            </w:pPr>
+            <w:tcW w:w="1700" w:type="dxa"/>
+            <w:tcBorders>
+              <w:top w:val="single" w:sz="4" w:space="0" w:color="CCCCCC"/>
+              <w:left w:val="single" w:sz="4" w:space="0" w:color="CCCCCC"/>
+              <w:bottom w:val="single" w:sz="4" w:space="0" w:color="CCCCCC"/>
+              <w:right w:val="single" w:sz="4" w:space="0" w:color="CCCCCC"/>
+            </w:tcBorders>
+            <w:tcMar>
+              <w:top w:w="80" w:type="dxa"/>
+              <w:start w:w="120" w:type="dxa"/>
+              <w:bottom w:w="80" w:type="dxa"/>
+              <w:end w:w="120" w:type="dxa"/>
+            </w:tcMar>
+          </w:tcPr>
+          <w:p>
             <w:r>
               <w:t xml:space="preserve">PARTIALLY MET</w:t>
             </w:r>
@@ -535,7 +818,7 @@
         <w:pStyle w:val="Heading1"/>
       </w:pPr>
       <w:r>
-        <w:t>What Was Implemented</w:t>
+        <w:t xml:space="preserve">What Was Implemented</w:t>
       </w:r>
     </w:p>
     <w:p>
@@ -543,7 +826,7 @@
         <w:pStyle w:val="Heading2"/>
       </w:pPr>
       <w:r>
-        <w:t>ARIA and Screen Reader Support (C.1, C.14)</w:t>
+        <w:t xml:space="preserve">ARIA and Screen Reader Support (C.1, C.14)</w:t>
       </w:r>
     </w:p>
     <w:p>
@@ -551,7 +834,7 @@
         <w:pStyle w:val="ListParagraph"/>
         <w:numPr>
           <w:ilvl w:val="0"/>
-          <w:numId w:val="1"/>
+          <w:numId w:val="2"/>
         </w:numPr>
       </w:pPr>
       <w:r>
@@ -563,7 +846,7 @@
         <w:pStyle w:val="ListParagraph"/>
         <w:numPr>
           <w:ilvl w:val="0"/>
-          <w:numId w:val="1"/>
+          <w:numId w:val="2"/>
         </w:numPr>
       </w:pPr>
       <w:r>
@@ -575,7 +858,7 @@
         <w:pStyle w:val="ListParagraph"/>
         <w:numPr>
           <w:ilvl w:val="0"/>
-          <w:numId w:val="1"/>
+          <w:numId w:val="2"/>
         </w:numPr>
       </w:pPr>
       <w:r>
@@ -587,7 +870,7 @@
         <w:pStyle w:val="ListParagraph"/>
         <w:numPr>
           <w:ilvl w:val="0"/>
-          <w:numId w:val="1"/>
+          <w:numId w:val="2"/>
         </w:numPr>
       </w:pPr>
       <w:r>
@@ -599,7 +882,7 @@
         <w:pStyle w:val="ListParagraph"/>
         <w:numPr>
           <w:ilvl w:val="0"/>
-          <w:numId w:val="1"/>
+          <w:numId w:val="2"/>
         </w:numPr>
       </w:pPr>
       <w:r>
@@ -611,11 +894,11 @@
         <w:pStyle w:val="ListParagraph"/>
         <w:numPr>
           <w:ilvl w:val="0"/>
-          <w:numId w:val="1"/>
+          <w:numId w:val="2"/>
         </w:numPr>
       </w:pPr>
       <w:r>
-        <w:t xml:space="preserve">.sr-only spans inside color-only dot indicators ("Online" / "Offline")</w:t>
+        <w:t xml:space="preserve">.sr-only spans inside color-only dot indicators (Online / Offline)</w:t>
       </w:r>
     </w:p>
     <w:p>
@@ -623,15 +906,7 @@
         <w:pStyle w:val="Heading2"/>
       </w:pPr>
       <w:r>
-        <w:t>Full Dashboard ARIA Audit (C.1, C.14)</w:t>
-      </w:r>
-    </w:p>
-    <w:p>
-      <w:pPr>
-        <w:pStyle w:val="Normal"/>
-      </w:pPr>
-      <w:r>
-        <w:t xml:space="preserve">A second pass extended ARIA coverage from Port Status to every remaining dashboard card:</w:t>
+        <w:t xml:space="preserve">Keyboard Navigation (C.3)</w:t>
       </w:r>
     </w:p>
     <w:p>
@@ -639,11 +914,11 @@
         <w:pStyle w:val="ListParagraph"/>
         <w:numPr>
           <w:ilvl w:val="0"/>
-          <w:numId w:val="1"/>
+          <w:numId w:val="2"/>
         </w:numPr>
       </w:pPr>
       <w:r>
-        <w:t xml:space="preserve">Alarms: severity dot aria-hidden; alarm row role=listitem + aria-label (severity + name); dismiss button aria-label</w:t>
+        <w:t xml:space="preserve">tabindex=0 on all SVG port groups and detail cards</w:t>
       </w:r>
     </w:p>
     <w:p>
@@ -651,11 +926,11 @@
         <w:pStyle w:val="ListParagraph"/>
         <w:numPr>
           <w:ilvl w:val="0"/>
-          <w:numId w:val="1"/>
+          <w:numId w:val="2"/>
         </w:numPr>
       </w:pPr>
       <w:r>
-        <w:t xml:space="preserve">Events: event row role=listitem + aria-label; priority bar aria-hidden + .sr-only severity text; count badges labeled; acknowledge button aria-label; events list aria-live=polite</w:t>
+        <w:t xml:space="preserve">Focus order matches visual reading order</w:t>
       </w:r>
     </w:p>
     <w:p>
@@ -663,11 +938,19 @@
         <w:pStyle w:val="ListParagraph"/>
         <w:numPr>
           <w:ilvl w:val="0"/>
-          <w:numId w:val="1"/>
+          <w:numId w:val="2"/>
         </w:numPr>
       </w:pPr>
       <w:r>
-        <w:t xml:space="preserve">Top Flows / Top Hosts: each row role=listitem + aria-label (full plaintext summary); decorative cell content aria-hidden</w:t>
+        <w:t xml:space="preserve">All Port Status interactions reachable by Tab key alone</w:t>
+      </w:r>
+    </w:p>
+    <w:p>
+      <w:pPr>
+        <w:pStyle w:val="Heading2"/>
+      </w:pPr>
+      <w:r>
+        <w:t xml:space="preserve">Focus Visibility (WCAG 2.4.7 / 2.4.11)</w:t>
       </w:r>
     </w:p>
     <w:p>
@@ -675,11 +958,11 @@
         <w:pStyle w:val="ListParagraph"/>
         <w:numPr>
           <w:ilvl w:val="0"/>
-          <w:numId w:val="1"/>
+          <w:numId w:val="2"/>
         </w:numPr>
       </w:pPr>
       <w:r>
-        <w:t xml:space="preserve">MWAN: WAN and WWAN panels role=region with aria-label; state dot aria-hidden; latency and loss chips labeled; MWAN event rows role=listitem + aria-label; FA icons aria-hidden; usage bar role=img + aria-label</w:t>
+        <w:t xml:space="preserve">:focus-visible with outline + box-shadow glow on focusable cards and buttons</w:t>
       </w:r>
     </w:p>
     <w:p>
@@ -687,11 +970,11 @@
         <w:pStyle w:val="ListParagraph"/>
         <w:numPr>
           <w:ilvl w:val="0"/>
-          <w:numId w:val="1"/>
+          <w:numId w:val="2"/>
         </w:numPr>
       </w:pPr>
       <w:r>
-        <w:t xml:space="preserve">QoE pills: tabindex=0, role=img, aria-label (metric + value + rating); focus triggers showTooltipNearEl keyboard-accessible tooltip</w:t>
+        <w:t xml:space="preserve">SVG port shapes: filter: drop-shadow on focus</w:t>
       </w:r>
     </w:p>
     <w:p>
@@ -699,11 +982,19 @@
         <w:pStyle w:val="ListParagraph"/>
         <w:numPr>
           <w:ilvl w:val="0"/>
-          <w:numId w:val="1"/>
+          <w:numId w:val="2"/>
         </w:numPr>
       </w:pPr>
       <w:r>
-        <w:t xml:space="preserve">Airtime bars: tabindex=0, role=img, aria-label (band + per-client breakdown); focus triggers showTooltipNearEl</w:t>
+        <w:t xml:space="preserve">Glowing frame visible in both dark and light themes</w:t>
+      </w:r>
+    </w:p>
+    <w:p>
+      <w:pPr>
+        <w:pStyle w:val="Heading2"/>
+      </w:pPr>
+      <w:r>
+        <w:t xml:space="preserve">Non-Color Indicators (C.5)</w:t>
       </w:r>
     </w:p>
     <w:p>
@@ -711,11 +1002,11 @@
         <w:pStyle w:val="ListParagraph"/>
         <w:numPr>
           <w:ilvl w:val="0"/>
-          <w:numId w:val="1"/>
+          <w:numId w:val="2"/>
         </w:numPr>
       </w:pPr>
       <w:r>
-        <w:t xml:space="preserve">Throughput chart: live canvas aria-label updated with current DL/UL values on every redraw</w:t>
+        <w:t xml:space="preserve">State dots: filled circle (up) vs hollow ring (down) -- shape differs independently of color</w:t>
       </w:r>
     </w:p>
     <w:p>
@@ -723,19 +1014,11 @@
         <w:pStyle w:val="ListParagraph"/>
         <w:numPr>
           <w:ilvl w:val="0"/>
-          <w:numId w:val="1"/>
+          <w:numId w:val="2"/>
         </w:numPr>
       </w:pPr>
       <w:r>
-        <w:t xml:space="preserve">Flow sparklines: SVG aria-hidden=true focusable=false (decorative)</w:t>
-      </w:r>
-    </w:p>
-    <w:p>
-      <w:pPr>
-        <w:pStyle w:val="Heading2"/>
-      </w:pPr>
-      <w:r>
-        <w:t>Keyboard Navigation (C.3)</w:t>
+        <w:t xml:space="preserve">Event log dots: same filled/hollow pattern</w:t>
       </w:r>
     </w:p>
     <w:p>
@@ -743,11 +1026,35 @@
         <w:pStyle w:val="ListParagraph"/>
         <w:numPr>
           <w:ilvl w:val="0"/>
-          <w:numId w:val="1"/>
+          <w:numId w:val="2"/>
         </w:numPr>
       </w:pPr>
       <w:r>
-        <w:t xml:space="preserve">tabindex=0 on all SVG port groups and detail cards</w:t>
+        <w:t xml:space="preserve">Badge and tooltip text labels carry full meaning without color</w:t>
+      </w:r>
+    </w:p>
+    <w:p>
+      <w:pPr>
+        <w:pStyle w:val="Heading2"/>
+      </w:pPr>
+      <w:r>
+        <w:t xml:space="preserve">Hardware LED State Mirror (C.5 / A.1 / A.3)</w:t>
+      </w:r>
+    </w:p>
+    <w:p>
+      <w:pPr>
+        <w:pStyle w:val="Normal"/>
+      </w:pPr>
+      <w:r>
+        <w:t xml:space="preserve">The front-panel LED is a single 4-color component (R/G/B/W) controlled by the MCU. The LED spec defines 13 device states. Several states share the same animation pattern and differ only by color (e.g. Hub WAN Down and Satellite Poor Signal both use Pulse Red+Green). This makes them indistinguishable to users with color vision deficiency -- an EAA A.1/A.3 hardware gap that cannot be closed without a product redesign.</w:t>
+      </w:r>
+    </w:p>
+    <w:p>
+      <w:pPr>
+        <w:pStyle w:val="Normal"/>
+      </w:pPr>
+      <w:r>
+        <w:t xml:space="preserve">WebUI mitigation implemented:</w:t>
       </w:r>
     </w:p>
     <w:p>
@@ -755,11 +1062,11 @@
         <w:pStyle w:val="ListParagraph"/>
         <w:numPr>
           <w:ilvl w:val="0"/>
-          <w:numId w:val="1"/>
+          <w:numId w:val="2"/>
         </w:numPr>
       </w:pPr>
       <w:r>
-        <w:t xml:space="preserve">Focus order matches visual reading order</w:t>
+        <w:t xml:space="preserve">MOCK.device.led_state field added; production source is the LED control script state machine</w:t>
       </w:r>
     </w:p>
     <w:p>
@@ -767,19 +1074,11 @@
         <w:pStyle w:val="ListParagraph"/>
         <w:numPr>
           <w:ilvl w:val="0"/>
-          <w:numId w:val="1"/>
+          <w:numId w:val="2"/>
         </w:numPr>
       </w:pPr>
       <w:r>
-        <w:t xml:space="preserve">All Port Status interactions reachable by Tab key alone</w:t>
-      </w:r>
-    </w:p>
-    <w:p>
-      <w:pPr>
-        <w:pStyle w:val="Heading2"/>
-      </w:pPr>
-      <w:r>
-        <w:t>Focus Visibility (WCAG 2.4.7 / 2.4.11)</w:t>
+        <w:t xml:space="preserve">LED_STATE_MAP in dashboard.js maps all 13 states to { label, pattern, cssClass }</w:t>
       </w:r>
     </w:p>
     <w:p>
@@ -787,11 +1086,11 @@
         <w:pStyle w:val="ListParagraph"/>
         <w:numPr>
           <w:ilvl w:val="0"/>
-          <w:numId w:val="1"/>
+          <w:numId w:val="2"/>
         </w:numPr>
       </w:pPr>
       <w:r>
-        <w:t xml:space="preserve">:focus-visible with outline + box-shadow glow on focusable cards and buttons</w:t>
+        <w:t xml:space="preserve">Device Info card renders a labeled text indicator: dot (animated, neutral color) + state name in monospace text</w:t>
       </w:r>
     </w:p>
     <w:p>
@@ -799,11 +1098,11 @@
         <w:pStyle w:val="ListParagraph"/>
         <w:numPr>
           <w:ilvl w:val="0"/>
-          <w:numId w:val="1"/>
+          <w:numId w:val="2"/>
         </w:numPr>
       </w:pPr>
       <w:r>
-        <w:t xml:space="preserve">SVG port shapes: filter: drop-shadow on focus</w:t>
+        <w:t xml:space="preserve">Animation classes: .led-solid (static), .led-pulse (breathing, 1.4s), .led-blink (step-end, 0.8s) match MCU patterns</w:t>
       </w:r>
     </w:p>
     <w:p>
@@ -811,19 +1110,11 @@
         <w:pStyle w:val="ListParagraph"/>
         <w:numPr>
           <w:ilvl w:val="0"/>
-          <w:numId w:val="1"/>
+          <w:numId w:val="2"/>
         </w:numPr>
       </w:pPr>
       <w:r>
-        <w:t xml:space="preserve">Glowing frame visible in both dark and light themes</w:t>
-      </w:r>
-    </w:p>
-    <w:p>
-      <w:pPr>
-        <w:pStyle w:val="Heading2"/>
-      </w:pPr>
-      <w:r>
-        <w:t>Non-Color Indicators (C.5)</w:t>
+        <w:t xml:space="preserve">role=status + aria-live=polite on the row; aria-label updated with current state name on every render</w:t>
       </w:r>
     </w:p>
     <w:p>
@@ -831,11 +1122,35 @@
         <w:pStyle w:val="ListParagraph"/>
         <w:numPr>
           <w:ilvl w:val="0"/>
-          <w:numId w:val="1"/>
+          <w:numId w:val="2"/>
         </w:numPr>
       </w:pPr>
       <w:r>
-        <w:t xml:space="preserve">State dots: filled circle (up) vs hollow ring (down) -- shape differs independently of color</w:t>
+        <w:t xml:space="preserve">No color dependency: the text label carries full meaning independently of the dot animation</w:t>
+      </w:r>
+    </w:p>
+    <w:p>
+      <w:pPr>
+        <w:pStyle w:val="Normal"/>
+      </w:pPr>
+      <w:r>
+        <w:t xml:space="preserve">This does not close the hardware A.1/A.3 gap for users of the physical device, but it ensures any user accessing the WebUI can read the current LED state without relying on color or physical sight of the device.</w:t>
+      </w:r>
+    </w:p>
+    <w:p>
+      <w:pPr>
+        <w:pStyle w:val="Heading2"/>
+      </w:pPr>
+      <w:r>
+        <w:t xml:space="preserve">Full Dashboard ARIA Audit (C.1, C.14)</w:t>
+      </w:r>
+    </w:p>
+    <w:p>
+      <w:pPr>
+        <w:pStyle w:val="Normal"/>
+      </w:pPr>
+      <w:r>
+        <w:t xml:space="preserve">A second pass extended ARIA coverage from Port Status to every remaining dashboard card:</w:t>
       </w:r>
     </w:p>
     <w:p>
@@ -843,11 +1158,11 @@
         <w:pStyle w:val="ListParagraph"/>
         <w:numPr>
           <w:ilvl w:val="0"/>
-          <w:numId w:val="1"/>
+          <w:numId w:val="2"/>
         </w:numPr>
       </w:pPr>
       <w:r>
-        <w:t xml:space="preserve">Event log dots: same filled/hollow pattern</w:t>
+        <w:t xml:space="preserve">Alarms: severity dot aria-hidden; alarm row role=listitem + aria-label (severity + name); dismiss button aria-label</w:t>
       </w:r>
     </w:p>
     <w:p>
@@ -855,35 +1170,11 @@
         <w:pStyle w:val="ListParagraph"/>
         <w:numPr>
           <w:ilvl w:val="0"/>
-          <w:numId w:val="1"/>
+          <w:numId w:val="2"/>
         </w:numPr>
       </w:pPr>
       <w:r>
-        <w:t xml:space="preserve">Badge and tooltip text labels carry full meaning without color</w:t>
-      </w:r>
-    </w:p>
-    <w:p>
-      <w:pPr>
-        <w:pStyle w:val="Heading2"/>
-      </w:pPr>
-      <w:r>
-        <w:t>Hardware LED State Mirror (C.5 / A.1 / A.3)</w:t>
-      </w:r>
-    </w:p>
-    <w:p>
-      <w:pPr>
-        <w:pStyle w:val="Normal"/>
-      </w:pPr>
-      <w:r>
-        <w:t xml:space="preserve">The front-panel LED is a single 4-color component (R/G/B/W) controlled by the MCU. The LED spec defines 13 device states. Several states share the same animation pattern and differ only by color (e.g., Hub WAN Down and Satellite Poor Signal both use Pulse Red+Green). This makes them indistinguishable to users with color vision deficiency, an EAA A.1/A.3 hardware gap that cannot be closed without a product redesign.</w:t>
-      </w:r>
-    </w:p>
-    <w:p>
-      <w:pPr>
-        <w:pStyle w:val="Normal"/>
-      </w:pPr>
-      <w:r>
-        <w:t xml:space="preserve">WebUI mitigation implemented:</w:t>
+        <w:t xml:space="preserve">Events: event row role=listitem + aria-label; priority bar aria-hidden + .sr-only severity text; count badges labeled; acknowledge button aria-label; events list aria-live=polite</w:t>
       </w:r>
     </w:p>
     <w:p>
@@ -891,11 +1182,11 @@
         <w:pStyle w:val="ListParagraph"/>
         <w:numPr>
           <w:ilvl w:val="0"/>
-          <w:numId w:val="1"/>
+          <w:numId w:val="2"/>
         </w:numPr>
       </w:pPr>
       <w:r>
-        <w:t xml:space="preserve">MOCK.device.led_state field added; production source is the LED control script state machine</w:t>
+        <w:t xml:space="preserve">Top Flows / Top Hosts: each row role=listitem + aria-label (full plaintext summary); decorative cell content aria-hidden</w:t>
       </w:r>
     </w:p>
     <w:p>
@@ -903,11 +1194,11 @@
         <w:pStyle w:val="ListParagraph"/>
         <w:numPr>
           <w:ilvl w:val="0"/>
-          <w:numId w:val="1"/>
+          <w:numId w:val="2"/>
         </w:numPr>
       </w:pPr>
       <w:r>
-        <w:t xml:space="preserve">LED_STATE_MAP in dashboard.js maps all 13 states to { label, pattern, cssClass }</w:t>
+        <w:t xml:space="preserve">MWAN: WAN and WWAN panels role=region with aria-label; state dot aria-hidden; latency and loss chips labeled; MWAN event rows role=listitem + aria-label; FA icons aria-hidden; usage bar role=img + aria-label</w:t>
       </w:r>
     </w:p>
     <w:p>
@@ -915,11 +1206,11 @@
         <w:pStyle w:val="ListParagraph"/>
         <w:numPr>
           <w:ilvl w:val="0"/>
-          <w:numId w:val="1"/>
+          <w:numId w:val="2"/>
         </w:numPr>
       </w:pPr>
       <w:r>
-        <w:t xml:space="preserve">Device Info card renders a labeled text indicator: dot (animated, neutral color) + state name in monospace text</w:t>
+        <w:t xml:space="preserve">QoE pills: tabindex=0, role=img, aria-label (metric + value + rating); focus triggers showTooltipNearEl keyboard-accessible tooltip</w:t>
       </w:r>
     </w:p>
     <w:p>
@@ -927,11 +1218,11 @@
         <w:pStyle w:val="ListParagraph"/>
         <w:numPr>
           <w:ilvl w:val="0"/>
-          <w:numId w:val="1"/>
+          <w:numId w:val="2"/>
         </w:numPr>
       </w:pPr>
       <w:r>
-        <w:t xml:space="preserve">Animation classes: .led-solid (static), .led-pulse (breathing, 1.4s), .led-blink (step-end, 0.8s) match MCU patterns</w:t>
+        <w:t xml:space="preserve">Airtime bars: tabindex=0, role=img, aria-label (band + per-client breakdown); focus triggers showTooltipNearEl</w:t>
       </w:r>
     </w:p>
     <w:p>
@@ -939,11 +1230,11 @@
         <w:pStyle w:val="ListParagraph"/>
         <w:numPr>
           <w:ilvl w:val="0"/>
-          <w:numId w:val="1"/>
+          <w:numId w:val="2"/>
         </w:numPr>
       </w:pPr>
       <w:r>
-        <w:t xml:space="preserve">role=status + aria-live=polite on the row; aria-label updated with current state name on every render</w:t>
+        <w:t xml:space="preserve">Throughput chart: live canvas aria-label updated with current DL/UL values on every redraw</w:t>
       </w:r>
     </w:p>
     <w:p>
@@ -951,11 +1242,19 @@
         <w:pStyle w:val="ListParagraph"/>
         <w:numPr>
           <w:ilvl w:val="0"/>
-          <w:numId w:val="1"/>
+          <w:numId w:val="2"/>
         </w:numPr>
       </w:pPr>
       <w:r>
-        <w:t xml:space="preserve">No color dependency: the text label carries full meaning independently of the dot animation</w:t>
+        <w:t xml:space="preserve">Flow sparklines: SVG aria-hidden=true focusable=false (decorative)</w:t>
+      </w:r>
+    </w:p>
+    <w:p>
+      <w:pPr>
+        <w:pStyle w:val="Heading2"/>
+      </w:pPr>
+      <w:r>
+        <w:t xml:space="preserve">WCAG Contrast Audit (C.4)</w:t>
       </w:r>
     </w:p>
     <w:p>
@@ -963,15 +1262,7 @@
         <w:pStyle w:val="Normal"/>
       </w:pPr>
       <w:r>
-        <w:t xml:space="preserve">This does not close the hardware A.1/A.3 gap for users of the physical device, but it ensures any user accessing the WebUI can read the current LED state without relying on color or physical sight of the device.</w:t>
-      </w:r>
-    </w:p>
-    <w:p>
-      <w:pPr>
-        <w:pStyle w:val="Heading2"/>
-      </w:pPr>
-      <w:r>
-        <w:t>WCAG Contrast Audit (C.4)</w:t>
+        <w:t xml:space="preserve">A formal WCAG 2.1 AA (4.5:1 normal text) audit was run programmatically in-browser across both dark and light themes. All failing color pairs were identified and remediated.</w:t>
       </w:r>
     </w:p>
     <w:p>
@@ -979,14 +1270,9 @@
         <w:pStyle w:val="Normal"/>
       </w:pPr>
       <w:r>
-        <w:t xml:space="preserve">A formal WCAG 2.1 AA (4.5:1 normal text) audit was run programmatically in-browser across both dark and light themes. All failing color pairs were identified and remediated.</w:t>
-      </w:r>
-    </w:p>
-    <w:p>
-      <w:pPr>
-        <w:pStyle w:val="Normal"/>
-      </w:pPr>
-      <w:r>
+        <w:rPr>
+          <w:b/>
+        </w:rPr>
         <w:t xml:space="preserve">Dark theme normal-text fixes:</w:t>
       </w:r>
     </w:p>
@@ -995,7 +1281,7 @@
         <w:pStyle w:val="ListParagraph"/>
         <w:numPr>
           <w:ilvl w:val="0"/>
-          <w:numId w:val="1"/>
+          <w:numId w:val="2"/>
         </w:numPr>
       </w:pPr>
       <w:r>
@@ -1007,7 +1293,7 @@
         <w:pStyle w:val="ListParagraph"/>
         <w:numPr>
           <w:ilvl w:val="0"/>
-          <w:numId w:val="1"/>
+          <w:numId w:val="2"/>
         </w:numPr>
       </w:pPr>
       <w:r>
@@ -1019,7 +1305,7 @@
         <w:pStyle w:val="ListParagraph"/>
         <w:numPr>
           <w:ilvl w:val="0"/>
-          <w:numId w:val="1"/>
+          <w:numId w:val="2"/>
         </w:numPr>
       </w:pPr>
       <w:r>
@@ -1031,7 +1317,7 @@
         <w:pStyle w:val="ListParagraph"/>
         <w:numPr>
           <w:ilvl w:val="0"/>
-          <w:numId w:val="1"/>
+          <w:numId w:val="2"/>
         </w:numPr>
       </w:pPr>
       <w:r>
@@ -1043,6 +1329,9 @@
         <w:pStyle w:val="Normal"/>
       </w:pPr>
       <w:r>
+        <w:rPr>
+          <w:b/>
+        </w:rPr>
         <w:t xml:space="preserve">Light theme normal-text fixes:</w:t>
       </w:r>
     </w:p>
@@ -1051,7 +1340,7 @@
         <w:pStyle w:val="ListParagraph"/>
         <w:numPr>
           <w:ilvl w:val="0"/>
-          <w:numId w:val="1"/>
+          <w:numId w:val="2"/>
         </w:numPr>
       </w:pPr>
       <w:r>
@@ -1063,7 +1352,7 @@
         <w:pStyle w:val="ListParagraph"/>
         <w:numPr>
           <w:ilvl w:val="0"/>
-          <w:numId w:val="1"/>
+          <w:numId w:val="2"/>
         </w:numPr>
       </w:pPr>
       <w:r>
@@ -1075,11 +1364,11 @@
         <w:pStyle w:val="ListParagraph"/>
         <w:numPr>
           <w:ilvl w:val="0"/>
-          <w:numId w:val="1"/>
+          <w:numId w:val="2"/>
         </w:numPr>
       </w:pPr>
       <w:r>
-        <w:t xml:space="preserve">Cyan #00C8E6 -&gt; #0e7490: 5.36:1; Green #34d399 -&gt; #15803d: 5.02:1</w:t>
+        <w:t xml:space="preserve">Cyan #00C8E6 to #0e7490: 5.36:1; Green #34d399 to #15803d: 5.02:1</w:t>
       </w:r>
     </w:p>
     <w:p>
@@ -1087,11 +1376,11 @@
         <w:pStyle w:val="ListParagraph"/>
         <w:numPr>
           <w:ilvl w:val="0"/>
-          <w:numId w:val="1"/>
+          <w:numId w:val="2"/>
         </w:numPr>
       </w:pPr>
       <w:r>
-        <w:t xml:space="preserve">Amber #f59e0b -&gt; #b45309: 5.02:1; Red #ef4444 -&gt; #dc2626: 4.83:1</w:t>
+        <w:t xml:space="preserve">Amber #f59e0b to #b45309: 5.02:1; Red #ef4444 to #dc2626: 4.83:1</w:t>
       </w:r>
     </w:p>
     <w:p>
@@ -1099,11 +1388,11 @@
         <w:pStyle w:val="ListParagraph"/>
         <w:numPr>
           <w:ilvl w:val="0"/>
-          <w:numId w:val="1"/>
+          <w:numId w:val="2"/>
         </w:numPr>
       </w:pPr>
       <w:r>
-        <w:t xml:space="preserve">Blue #3b82f6 -&gt; #2563eb: 5.17:1; Purple #a78bfa -&gt; #7c3aed: 5.70:1</w:t>
+        <w:t xml:space="preserve">Blue #3b82f6 to #2563eb: 5.17:1; Purple #a78bfa to #7c3aed: 5.70:1</w:t>
       </w:r>
     </w:p>
     <w:p>
@@ -1111,6 +1400,9 @@
         <w:pStyle w:val="Normal"/>
       </w:pPr>
       <w:r>
+        <w:rPr>
+          <w:b/>
+        </w:rPr>
         <w:t xml:space="preserve">Large text 3:1 scan (WCAG 1.4.3):</w:t>
       </w:r>
     </w:p>
@@ -1119,7 +1411,7 @@
         <w:pStyle w:val="ListParagraph"/>
         <w:numPr>
           <w:ilvl w:val="0"/>
-          <w:numId w:val="1"/>
+          <w:numId w:val="2"/>
         </w:numPr>
       </w:pPr>
       <w:r>
@@ -1131,7 +1423,7 @@
         <w:pStyle w:val="ListParagraph"/>
         <w:numPr>
           <w:ilvl w:val="0"/>
-          <w:numId w:val="1"/>
+          <w:numId w:val="2"/>
         </w:numPr>
       </w:pPr>
       <w:r>
@@ -1143,6 +1435,9 @@
         <w:pStyle w:val="Normal"/>
       </w:pPr>
       <w:r>
+        <w:rPr>
+          <w:b/>
+        </w:rPr>
         <w:t xml:space="preserve">Non-text contrast (WCAG 1.4.11):</w:t>
       </w:r>
     </w:p>
@@ -1151,7 +1446,7 @@
         <w:pStyle w:val="ListParagraph"/>
         <w:numPr>
           <w:ilvl w:val="0"/>
-          <w:numId w:val="1"/>
+          <w:numId w:val="2"/>
         </w:numPr>
       </w:pPr>
       <w:r>
@@ -1163,11 +1458,11 @@
         <w:pStyle w:val="ListParagraph"/>
         <w:numPr>
           <w:ilvl w:val="0"/>
-          <w:numId w:val="1"/>
+          <w:numId w:val="2"/>
         </w:numPr>
       </w:pPr>
       <w:r>
-        <w:t xml:space="preserve">--border-bright raised from #374151 to #6b7280: 3.52:1 on card</w:t>
+        <w:t xml:space="preserve">Applied --border-ui to: shaper-input, shaper-select, sv-goto-input, sv-sort-select, btn-topbar, theme-toggle, st-advanced-toggle, sth-export-btn, shaper-btn-cancel</w:t>
       </w:r>
     </w:p>
     <w:p>
@@ -1175,11 +1470,11 @@
         <w:pStyle w:val="ListParagraph"/>
         <w:numPr>
           <w:ilvl w:val="0"/>
-          <w:numId w:val="1"/>
+          <w:numId w:val="2"/>
         </w:numPr>
       </w:pPr>
       <w:r>
-        <w:t xml:space="preserve">Applied --border-ui to: shaper-input, shaper-select, sv-goto-input, sv-sort-select, btn-topbar, theme-toggle, st-advanced-toggle, sth-export-btn, shaper-btn-cancel</w:t>
+        <w:t xml:space="preserve">--border-bright raised from #374151 to #6b7280: 3.52:1 on card</w:t>
       </w:r>
     </w:p>
     <w:p>
@@ -1187,11 +1482,11 @@
         <w:pStyle w:val="ListParagraph"/>
         <w:numPr>
           <w:ilvl w:val="0"/>
-          <w:numId w:val="1"/>
+          <w:numId w:val="2"/>
         </w:numPr>
       </w:pPr>
       <w:r>
-        <w:t xml:space="preserve">Global input[type=checkbox/radio]: accent-color: var(--accent-cyan) + outline: 1px solid var(--border-ui) ensures 3:1 boundary on all dark surfaces</w:t>
+        <w:t xml:space="preserve">Global input[type=checkbox/radio]: accent-color + outline: 1px solid var(--border-ui) ensures 3:1 boundary on all dark surfaces</w:t>
       </w:r>
     </w:p>
     <w:p>
@@ -1199,7 +1494,7 @@
         <w:pStyle w:val="ListParagraph"/>
         <w:numPr>
           <w:ilvl w:val="0"/>
-          <w:numId w:val="1"/>
+          <w:numId w:val="2"/>
         </w:numPr>
       </w:pPr>
       <w:r>
@@ -1208,18 +1503,10 @@
     </w:p>
     <w:p>
       <w:pPr>
-        <w:pStyle w:val="Normal"/>
-      </w:pPr>
-      <w:r>
-        <w:t xml:space="preserve">No color dependency introduced: overrides scoped to interactive control rules only.</w:t>
-      </w:r>
-    </w:p>
-    <w:p>
-      <w:pPr>
         <w:pStyle w:val="Heading2"/>
       </w:pPr>
       <w:r>
-        <w:t>Multi-Sensory Feedback (C.2)</w:t>
+        <w:t xml:space="preserve">Multi-Sensory Feedback (C.2)</w:t>
       </w:r>
     </w:p>
     <w:p>
@@ -1227,7 +1514,7 @@
         <w:pStyle w:val="ListParagraph"/>
         <w:numPr>
           <w:ilvl w:val="0"/>
-          <w:numId w:val="1"/>
+          <w:numId w:val="2"/>
         </w:numPr>
       </w:pPr>
       <w:r>
@@ -1239,7 +1526,7 @@
         <w:pStyle w:val="ListParagraph"/>
         <w:numPr>
           <w:ilvl w:val="0"/>
-          <w:numId w:val="1"/>
+          <w:numId w:val="2"/>
         </w:numPr>
       </w:pPr>
       <w:r>
@@ -1251,7 +1538,7 @@
         <w:pStyle w:val="ListParagraph"/>
         <w:numPr>
           <w:ilvl w:val="0"/>
-          <w:numId w:val="1"/>
+          <w:numId w:val="2"/>
         </w:numPr>
       </w:pPr>
       <w:r>
@@ -1263,7 +1550,7 @@
         <w:pStyle w:val="Heading2"/>
       </w:pPr>
       <w:r>
-        <w:t>Forced Colors / High Contrast Mode (C.7)</w:t>
+        <w:t xml:space="preserve">Forced Colors / High Contrast Mode (C.7)</w:t>
       </w:r>
     </w:p>
     <w:p>
@@ -1271,7 +1558,7 @@
         <w:pStyle w:val="ListParagraph"/>
         <w:numPr>
           <w:ilvl w:val="0"/>
-          <w:numId w:val="1"/>
+          <w:numId w:val="2"/>
         </w:numPr>
       </w:pPr>
       <w:r>
@@ -1283,7 +1570,7 @@
         <w:pStyle w:val="ListParagraph"/>
         <w:numPr>
           <w:ilvl w:val="0"/>
-          <w:numId w:val="1"/>
+          <w:numId w:val="2"/>
         </w:numPr>
       </w:pPr>
       <w:r>
@@ -1295,7 +1582,7 @@
         <w:pStyle w:val="ListParagraph"/>
         <w:numPr>
           <w:ilvl w:val="0"/>
-          <w:numId w:val="1"/>
+          <w:numId w:val="2"/>
         </w:numPr>
       </w:pPr>
       <w:r>
@@ -1312,7 +1599,7 @@
         <w:pStyle w:val="Heading1"/>
       </w:pPr>
       <w:r>
-        <w:t>Remaining Work for Full Compliance</w:t>
+        <w:t xml:space="preserve">Remaining Work for Full Compliance</w:t>
       </w:r>
     </w:p>
     <w:p>
@@ -1320,41 +1607,51 @@
         <w:pStyle w:val="Heading2"/>
       </w:pPr>
       <w:r>
-        <w:t>Software / UI (Engineering)</w:t>
+        <w:t xml:space="preserve">Software / UI (Engineering)</w:t>
       </w:r>
     </w:p>
     <w:tbl>
       <w:tblPr>
-        <w:tblStyle w:val="TableGrid"/>
-        <w:tblW w:w="9734" w:type="dxa"/>
+        <w:tblW w:w="6900" w:type="dxa"/>
         <w:tblBorders>
-          <w:top w:val="single" w:sz="4" w:space="0" w:color="auto"/>
-          <w:left w:val="single" w:sz="4" w:space="0" w:color="auto"/>
-          <w:bottom w:val="single" w:sz="4" w:space="0" w:color="auto"/>
-          <w:right w:val="single" w:sz="4" w:space="0" w:color="auto"/>
-          <w:insideH w:val="single" w:sz="4" w:space="0" w:color="auto"/>
-          <w:insideV w:val="single" w:sz="4" w:space="0" w:color="auto"/>
+          <w:top w:val="single" w:sz="4" w:space="0" w:color="CCCCCC"/>
+          <w:left w:val="single" w:sz="4" w:space="0" w:color="CCCCCC"/>
+          <w:bottom w:val="single" w:sz="4" w:space="0" w:color="CCCCCC"/>
+          <w:right w:val="single" w:sz="4" w:space="0" w:color="CCCCCC"/>
         </w:tblBorders>
-        <w:tblLook w:val="04A0" w:firstRow="1" w:lastRow="0" w:firstColumn="1" w:lastColumn="0" w:noHBand="0" w:noVBand="1"/>
+        <w:tblCellMar>
+          <w:top w:w="80" w:type="dxa"/>
+          <w:start w:w="120" w:type="dxa"/>
+          <w:bottom w:w="80" w:type="dxa"/>
+          <w:end w:w="120" w:type="dxa"/>
+        </w:tblCellMar>
+        <w:tblLook w:val="04A0"/>
       </w:tblPr>
       <w:tblGrid>
+        <w:gridCol w:w="1200"/>
+        <w:gridCol w:w="2200"/>
         <w:gridCol w:w="1100"/>
-        <w:gridCol w:w="2900"/>
-        <w:gridCol w:w="1134"/>
-        <w:gridCol w:w="4600"/>
+        <w:gridCol w:w="2400"/>
       </w:tblGrid>
       <w:tr>
         <w:tc>
           <w:tcPr>
-            <w:tcW w:w="1100" w:type="dxa"/>
-          </w:tcPr>
-          <w:p>
-            <w:pPr>
-              <w:pStyle w:val="TableHeader"/>
-              <w:rPr>
-                <w:b/>
-              </w:rPr>
-            </w:pPr>
+            <w:tcW w:w="1200" w:type="dxa"/>
+            <w:tcBorders>
+              <w:top w:val="single" w:sz="4" w:space="0" w:color="CCCCCC"/>
+              <w:left w:val="single" w:sz="4" w:space="0" w:color="CCCCCC"/>
+              <w:bottom w:val="single" w:sz="4" w:space="0" w:color="CCCCCC"/>
+              <w:right w:val="single" w:sz="4" w:space="0" w:color="CCCCCC"/>
+            </w:tcBorders>
+            <w:shd w:val="clear" w:color="auto" w:fill="D5E8F0"/>
+            <w:tcMar>
+              <w:top w:w="80" w:type="dxa"/>
+              <w:start w:w="120" w:type="dxa"/>
+              <w:bottom w:w="80" w:type="dxa"/>
+              <w:end w:w="120" w:type="dxa"/>
+            </w:tcMar>
+          </w:tcPr>
+          <w:p>
             <w:r>
               <w:rPr>
                 <w:b/>
@@ -1365,15 +1662,22 @@
         </w:tc>
         <w:tc>
           <w:tcPr>
-            <w:tcW w:w="2900" w:type="dxa"/>
-          </w:tcPr>
-          <w:p>
-            <w:pPr>
-              <w:pStyle w:val="TableHeader"/>
-              <w:rPr>
-                <w:b/>
-              </w:rPr>
-            </w:pPr>
+            <w:tcW w:w="2200" w:type="dxa"/>
+            <w:tcBorders>
+              <w:top w:val="single" w:sz="4" w:space="0" w:color="CCCCCC"/>
+              <w:left w:val="single" w:sz="4" w:space="0" w:color="CCCCCC"/>
+              <w:bottom w:val="single" w:sz="4" w:space="0" w:color="CCCCCC"/>
+              <w:right w:val="single" w:sz="4" w:space="0" w:color="CCCCCC"/>
+            </w:tcBorders>
+            <w:shd w:val="clear" w:color="auto" w:fill="D5E8F0"/>
+            <w:tcMar>
+              <w:top w:w="80" w:type="dxa"/>
+              <w:start w:w="120" w:type="dxa"/>
+              <w:bottom w:w="80" w:type="dxa"/>
+              <w:end w:w="120" w:type="dxa"/>
+            </w:tcMar>
+          </w:tcPr>
+          <w:p>
             <w:r>
               <w:rPr>
                 <w:b/>
@@ -1384,15 +1688,22 @@
         </w:tc>
         <w:tc>
           <w:tcPr>
-            <w:tcW w:w="1134" w:type="dxa"/>
-          </w:tcPr>
-          <w:p>
-            <w:pPr>
-              <w:pStyle w:val="TableHeader"/>
-              <w:rPr>
-                <w:b/>
-              </w:rPr>
-            </w:pPr>
+            <w:tcW w:w="1100" w:type="dxa"/>
+            <w:tcBorders>
+              <w:top w:val="single" w:sz="4" w:space="0" w:color="CCCCCC"/>
+              <w:left w:val="single" w:sz="4" w:space="0" w:color="CCCCCC"/>
+              <w:bottom w:val="single" w:sz="4" w:space="0" w:color="CCCCCC"/>
+              <w:right w:val="single" w:sz="4" w:space="0" w:color="CCCCCC"/>
+            </w:tcBorders>
+            <w:shd w:val="clear" w:color="auto" w:fill="D5E8F0"/>
+            <w:tcMar>
+              <w:top w:w="80" w:type="dxa"/>
+              <w:start w:w="120" w:type="dxa"/>
+              <w:bottom w:w="80" w:type="dxa"/>
+              <w:end w:w="120" w:type="dxa"/>
+            </w:tcMar>
+          </w:tcPr>
+          <w:p>
             <w:r>
               <w:rPr>
                 <w:b/>
@@ -1403,15 +1714,22 @@
         </w:tc>
         <w:tc>
           <w:tcPr>
-            <w:tcW w:w="4600" w:type="dxa"/>
-          </w:tcPr>
-          <w:p>
-            <w:pPr>
-              <w:pStyle w:val="TableHeader"/>
-              <w:rPr>
-                <w:b/>
-              </w:rPr>
-            </w:pPr>
+            <w:tcW w:w="2400" w:type="dxa"/>
+            <w:tcBorders>
+              <w:top w:val="single" w:sz="4" w:space="0" w:color="CCCCCC"/>
+              <w:left w:val="single" w:sz="4" w:space="0" w:color="CCCCCC"/>
+              <w:bottom w:val="single" w:sz="4" w:space="0" w:color="CCCCCC"/>
+              <w:right w:val="single" w:sz="4" w:space="0" w:color="CCCCCC"/>
+            </w:tcBorders>
+            <w:shd w:val="clear" w:color="auto" w:fill="D5E8F0"/>
+            <w:tcMar>
+              <w:top w:w="80" w:type="dxa"/>
+              <w:start w:w="120" w:type="dxa"/>
+              <w:bottom w:w="80" w:type="dxa"/>
+              <w:end w:w="120" w:type="dxa"/>
+            </w:tcMar>
+          </w:tcPr>
+          <w:p>
             <w:r>
               <w:rPr>
                 <w:b/>
@@ -1424,38 +1742,65 @@
       <w:tr>
         <w:tc>
           <w:tcPr>
+            <w:tcW w:w="1200" w:type="dxa"/>
+            <w:tcBorders>
+              <w:top w:val="single" w:sz="4" w:space="0" w:color="CCCCCC"/>
+              <w:left w:val="single" w:sz="4" w:space="0" w:color="CCCCCC"/>
+              <w:bottom w:val="single" w:sz="4" w:space="0" w:color="CCCCCC"/>
+              <w:right w:val="single" w:sz="4" w:space="0" w:color="CCCCCC"/>
+            </w:tcBorders>
+            <w:tcMar>
+              <w:top w:w="80" w:type="dxa"/>
+              <w:start w:w="120" w:type="dxa"/>
+              <w:bottom w:w="80" w:type="dxa"/>
+              <w:end w:w="120" w:type="dxa"/>
+            </w:tcMar>
+          </w:tcPr>
+          <w:p>
+            <w:r>
+              <w:t xml:space="preserve">HIGH</w:t>
+            </w:r>
+          </w:p>
+        </w:tc>
+        <w:tc>
+          <w:tcPr>
+            <w:tcW w:w="2200" w:type="dxa"/>
+            <w:tcBorders>
+              <w:top w:val="single" w:sz="4" w:space="0" w:color="CCCCCC"/>
+              <w:left w:val="single" w:sz="4" w:space="0" w:color="CCCCCC"/>
+              <w:bottom w:val="single" w:sz="4" w:space="0" w:color="CCCCCC"/>
+              <w:right w:val="single" w:sz="4" w:space="0" w:color="CCCCCC"/>
+            </w:tcBorders>
+            <w:tcMar>
+              <w:top w:w="80" w:type="dxa"/>
+              <w:start w:w="120" w:type="dxa"/>
+              <w:bottom w:w="80" w:type="dxa"/>
+              <w:end w:w="120" w:type="dxa"/>
+            </w:tcMar>
+          </w:tcPr>
+          <w:p>
+            <w:r>
+              <w:t xml:space="preserve">Dashboard chart indicators</w:t>
+            </w:r>
+          </w:p>
+        </w:tc>
+        <w:tc>
+          <w:tcPr>
             <w:tcW w:w="1100" w:type="dxa"/>
-          </w:tcPr>
-          <w:p>
-            <w:pPr>
-              <w:pStyle w:val="Normal"/>
-            </w:pPr>
-            <w:r>
-              <w:t xml:space="preserve">HIGH</w:t>
-            </w:r>
-          </w:p>
-        </w:tc>
-        <w:tc>
-          <w:tcPr>
-            <w:tcW w:w="2900" w:type="dxa"/>
-          </w:tcPr>
-          <w:p>
-            <w:pPr>
-              <w:pStyle w:val="Normal"/>
-            </w:pPr>
-            <w:r>
-              <w:t xml:space="preserve">Dashboard chart indicators</w:t>
-            </w:r>
-          </w:p>
-        </w:tc>
-        <w:tc>
-          <w:tcPr>
-            <w:tcW w:w="1134" w:type="dxa"/>
-          </w:tcPr>
-          <w:p>
-            <w:pPr>
-              <w:pStyle w:val="Normal"/>
-            </w:pPr>
+            <w:tcBorders>
+              <w:top w:val="single" w:sz="4" w:space="0" w:color="CCCCCC"/>
+              <w:left w:val="single" w:sz="4" w:space="0" w:color="CCCCCC"/>
+              <w:bottom w:val="single" w:sz="4" w:space="0" w:color="CCCCCC"/>
+              <w:right w:val="single" w:sz="4" w:space="0" w:color="CCCCCC"/>
+            </w:tcBorders>
+            <w:tcMar>
+              <w:top w:w="80" w:type="dxa"/>
+              <w:start w:w="120" w:type="dxa"/>
+              <w:bottom w:w="80" w:type="dxa"/>
+              <w:end w:w="120" w:type="dxa"/>
+            </w:tcMar>
+          </w:tcPr>
+          <w:p>
             <w:r>
               <w:t xml:space="preserve">C.2, C.5</w:t>
             </w:r>
@@ -1463,12 +1808,21 @@
         </w:tc>
         <w:tc>
           <w:tcPr>
-            <w:tcW w:w="4600" w:type="dxa"/>
-          </w:tcPr>
-          <w:p>
-            <w:pPr>
-              <w:pStyle w:val="Normal"/>
-            </w:pPr>
+            <w:tcW w:w="2400" w:type="dxa"/>
+            <w:tcBorders>
+              <w:top w:val="single" w:sz="4" w:space="0" w:color="CCCCCC"/>
+              <w:left w:val="single" w:sz="4" w:space="0" w:color="CCCCCC"/>
+              <w:bottom w:val="single" w:sz="4" w:space="0" w:color="CCCCCC"/>
+              <w:right w:val="single" w:sz="4" w:space="0" w:color="CCCCCC"/>
+            </w:tcBorders>
+            <w:tcMar>
+              <w:top w:w="80" w:type="dxa"/>
+              <w:start w:w="120" w:type="dxa"/>
+              <w:bottom w:w="80" w:type="dxa"/>
+              <w:end w:w="120" w:type="dxa"/>
+            </w:tcMar>
+          </w:tcPr>
+          <w:p>
             <w:r>
               <w:t xml:space="preserve">Add shape/pattern alternatives to throughput, airtime, and QoE charts -- currently color-primary only (keyboard tooltips added; visual shape coding outstanding)</w:t>
             </w:r>
@@ -1478,38 +1832,65 @@
       <w:tr>
         <w:tc>
           <w:tcPr>
+            <w:tcW w:w="1200" w:type="dxa"/>
+            <w:tcBorders>
+              <w:top w:val="single" w:sz="4" w:space="0" w:color="CCCCCC"/>
+              <w:left w:val="single" w:sz="4" w:space="0" w:color="CCCCCC"/>
+              <w:bottom w:val="single" w:sz="4" w:space="0" w:color="CCCCCC"/>
+              <w:right w:val="single" w:sz="4" w:space="0" w:color="CCCCCC"/>
+            </w:tcBorders>
+            <w:tcMar>
+              <w:top w:w="80" w:type="dxa"/>
+              <w:start w:w="120" w:type="dxa"/>
+              <w:bottom w:w="80" w:type="dxa"/>
+              <w:end w:w="120" w:type="dxa"/>
+            </w:tcMar>
+          </w:tcPr>
+          <w:p>
+            <w:r>
+              <w:t xml:space="preserve">LOW</w:t>
+            </w:r>
+          </w:p>
+        </w:tc>
+        <w:tc>
+          <w:tcPr>
+            <w:tcW w:w="2200" w:type="dxa"/>
+            <w:tcBorders>
+              <w:top w:val="single" w:sz="4" w:space="0" w:color="CCCCCC"/>
+              <w:left w:val="single" w:sz="4" w:space="0" w:color="CCCCCC"/>
+              <w:bottom w:val="single" w:sz="4" w:space="0" w:color="CCCCCC"/>
+              <w:right w:val="single" w:sz="4" w:space="0" w:color="CCCCCC"/>
+            </w:tcBorders>
+            <w:tcMar>
+              <w:top w:w="80" w:type="dxa"/>
+              <w:start w:w="120" w:type="dxa"/>
+              <w:bottom w:w="80" w:type="dxa"/>
+              <w:end w:w="120" w:type="dxa"/>
+            </w:tcMar>
+          </w:tcPr>
+          <w:p>
+            <w:r>
+              <w:t xml:space="preserve">Reflow at 320px viewport</w:t>
+            </w:r>
+          </w:p>
+        </w:tc>
+        <w:tc>
+          <w:tcPr>
             <w:tcW w:w="1100" w:type="dxa"/>
-          </w:tcPr>
-          <w:p>
-            <w:pPr>
-              <w:pStyle w:val="Normal"/>
-            </w:pPr>
-            <w:r>
-              <w:t xml:space="preserve">LOW</w:t>
-            </w:r>
-          </w:p>
-        </w:tc>
-        <w:tc>
-          <w:tcPr>
-            <w:tcW w:w="2900" w:type="dxa"/>
-          </w:tcPr>
-          <w:p>
-            <w:pPr>
-              <w:pStyle w:val="Normal"/>
-            </w:pPr>
-            <w:r>
-              <w:t xml:space="preserve">Reflow at 320px viewport</w:t>
-            </w:r>
-          </w:p>
-        </w:tc>
-        <w:tc>
-          <w:tcPr>
-            <w:tcW w:w="1134" w:type="dxa"/>
-          </w:tcPr>
-          <w:p>
-            <w:pPr>
-              <w:pStyle w:val="Normal"/>
-            </w:pPr>
+            <w:tcBorders>
+              <w:top w:val="single" w:sz="4" w:space="0" w:color="CCCCCC"/>
+              <w:left w:val="single" w:sz="4" w:space="0" w:color="CCCCCC"/>
+              <w:bottom w:val="single" w:sz="4" w:space="0" w:color="CCCCCC"/>
+              <w:right w:val="single" w:sz="4" w:space="0" w:color="CCCCCC"/>
+            </w:tcBorders>
+            <w:tcMar>
+              <w:top w:w="80" w:type="dxa"/>
+              <w:start w:w="120" w:type="dxa"/>
+              <w:bottom w:w="80" w:type="dxa"/>
+              <w:end w:w="120" w:type="dxa"/>
+            </w:tcMar>
+          </w:tcPr>
+          <w:p>
             <w:r>
               <w:t xml:space="preserve">C.4</w:t>
             </w:r>
@@ -1517,12 +1898,21 @@
         </w:tc>
         <w:tc>
           <w:tcPr>
-            <w:tcW w:w="4600" w:type="dxa"/>
-          </w:tcPr>
-          <w:p>
-            <w:pPr>
-              <w:pStyle w:val="Normal"/>
-            </w:pPr>
+            <w:tcW w:w="2400" w:type="dxa"/>
+            <w:tcBorders>
+              <w:top w:val="single" w:sz="4" w:space="0" w:color="CCCCCC"/>
+              <w:left w:val="single" w:sz="4" w:space="0" w:color="CCCCCC"/>
+              <w:bottom w:val="single" w:sz="4" w:space="0" w:color="CCCCCC"/>
+              <w:right w:val="single" w:sz="4" w:space="0" w:color="CCCCCC"/>
+            </w:tcBorders>
+            <w:tcMar>
+              <w:top w:w="80" w:type="dxa"/>
+              <w:start w:w="120" w:type="dxa"/>
+              <w:bottom w:w="80" w:type="dxa"/>
+              <w:end w:w="120" w:type="dxa"/>
+            </w:tcMar>
+          </w:tcPr>
+          <w:p>
             <w:r>
               <w:t xml:space="preserve">Verify WCAG 1.4.10: no horizontal scroll at 320px equivalent (400% zoom on 1280px screen)</w:t>
             </w:r>
@@ -1532,38 +1922,65 @@
       <w:tr>
         <w:tc>
           <w:tcPr>
+            <w:tcW w:w="1200" w:type="dxa"/>
+            <w:tcBorders>
+              <w:top w:val="single" w:sz="4" w:space="0" w:color="CCCCCC"/>
+              <w:left w:val="single" w:sz="4" w:space="0" w:color="CCCCCC"/>
+              <w:bottom w:val="single" w:sz="4" w:space="0" w:color="CCCCCC"/>
+              <w:right w:val="single" w:sz="4" w:space="0" w:color="CCCCCC"/>
+            </w:tcBorders>
+            <w:tcMar>
+              <w:top w:w="80" w:type="dxa"/>
+              <w:start w:w="120" w:type="dxa"/>
+              <w:bottom w:w="80" w:type="dxa"/>
+              <w:end w:w="120" w:type="dxa"/>
+            </w:tcMar>
+          </w:tcPr>
+          <w:p>
+            <w:r>
+              <w:t xml:space="preserve">MEDIUM</w:t>
+            </w:r>
+          </w:p>
+        </w:tc>
+        <w:tc>
+          <w:tcPr>
+            <w:tcW w:w="2200" w:type="dxa"/>
+            <w:tcBorders>
+              <w:top w:val="single" w:sz="4" w:space="0" w:color="CCCCCC"/>
+              <w:left w:val="single" w:sz="4" w:space="0" w:color="CCCCCC"/>
+              <w:bottom w:val="single" w:sz="4" w:space="0" w:color="CCCCCC"/>
+              <w:right w:val="single" w:sz="4" w:space="0" w:color="CCCCCC"/>
+            </w:tcBorders>
+            <w:tcMar>
+              <w:top w:w="80" w:type="dxa"/>
+              <w:start w:w="120" w:type="dxa"/>
+              <w:bottom w:w="80" w:type="dxa"/>
+              <w:end w:w="120" w:type="dxa"/>
+            </w:tcMar>
+          </w:tcPr>
+          <w:p>
+            <w:r>
+              <w:t xml:space="preserve">AT compatibility testing</w:t>
+            </w:r>
+          </w:p>
+        </w:tc>
+        <w:tc>
+          <w:tcPr>
             <w:tcW w:w="1100" w:type="dxa"/>
-          </w:tcPr>
-          <w:p>
-            <w:pPr>
-              <w:pStyle w:val="Normal"/>
-            </w:pPr>
-            <w:r>
-              <w:t xml:space="preserve">MEDIUM</w:t>
-            </w:r>
-          </w:p>
-        </w:tc>
-        <w:tc>
-          <w:tcPr>
-            <w:tcW w:w="2900" w:type="dxa"/>
-          </w:tcPr>
-          <w:p>
-            <w:pPr>
-              <w:pStyle w:val="Normal"/>
-            </w:pPr>
-            <w:r>
-              <w:t xml:space="preserve">AT compatibility testing</w:t>
-            </w:r>
-          </w:p>
-        </w:tc>
-        <w:tc>
-          <w:tcPr>
-            <w:tcW w:w="1134" w:type="dxa"/>
-          </w:tcPr>
-          <w:p>
-            <w:pPr>
-              <w:pStyle w:val="Normal"/>
-            </w:pPr>
+            <w:tcBorders>
+              <w:top w:val="single" w:sz="4" w:space="0" w:color="CCCCCC"/>
+              <w:left w:val="single" w:sz="4" w:space="0" w:color="CCCCCC"/>
+              <w:bottom w:val="single" w:sz="4" w:space="0" w:color="CCCCCC"/>
+              <w:right w:val="single" w:sz="4" w:space="0" w:color="CCCCCC"/>
+            </w:tcBorders>
+            <w:tcMar>
+              <w:top w:w="80" w:type="dxa"/>
+              <w:start w:w="120" w:type="dxa"/>
+              <w:bottom w:w="80" w:type="dxa"/>
+              <w:end w:w="120" w:type="dxa"/>
+            </w:tcMar>
+          </w:tcPr>
+          <w:p>
             <w:r>
               <w:t xml:space="preserve">C.1, C.14</w:t>
             </w:r>
@@ -1571,12 +1988,21 @@
         </w:tc>
         <w:tc>
           <w:tcPr>
-            <w:tcW w:w="4600" w:type="dxa"/>
-          </w:tcPr>
-          <w:p>
-            <w:pPr>
-              <w:pStyle w:val="Normal"/>
-            </w:pPr>
+            <w:tcW w:w="2400" w:type="dxa"/>
+            <w:tcBorders>
+              <w:top w:val="single" w:sz="4" w:space="0" w:color="CCCCCC"/>
+              <w:left w:val="single" w:sz="4" w:space="0" w:color="CCCCCC"/>
+              <w:bottom w:val="single" w:sz="4" w:space="0" w:color="CCCCCC"/>
+              <w:right w:val="single" w:sz="4" w:space="0" w:color="CCCCCC"/>
+            </w:tcBorders>
+            <w:tcMar>
+              <w:top w:w="80" w:type="dxa"/>
+              <w:start w:w="120" w:type="dxa"/>
+              <w:bottom w:w="80" w:type="dxa"/>
+              <w:end w:w="120" w:type="dxa"/>
+            </w:tcMar>
+          </w:tcPr>
+          <w:p>
             <w:r>
               <w:t xml:space="preserve">Formal screen reader testing with NVDA and JAWS; publish AT compatibility list (B.7)</w:t>
             </w:r>
@@ -1594,41 +2020,51 @@
         <w:pStyle w:val="Heading2"/>
       </w:pPr>
       <w:r>
-        <w:t>Documentation / Tech Pubs</w:t>
+        <w:t xml:space="preserve">Documentation / Tech Pubs</w:t>
       </w:r>
     </w:p>
     <w:tbl>
       <w:tblPr>
-        <w:tblStyle w:val="TableGrid"/>
-        <w:tblW w:w="9734" w:type="dxa"/>
+        <w:tblW w:w="6900" w:type="dxa"/>
         <w:tblBorders>
-          <w:top w:val="single" w:sz="4" w:space="0" w:color="auto"/>
-          <w:left w:val="single" w:sz="4" w:space="0" w:color="auto"/>
-          <w:bottom w:val="single" w:sz="4" w:space="0" w:color="auto"/>
-          <w:right w:val="single" w:sz="4" w:space="0" w:color="auto"/>
-          <w:insideH w:val="single" w:sz="4" w:space="0" w:color="auto"/>
-          <w:insideV w:val="single" w:sz="4" w:space="0" w:color="auto"/>
+          <w:top w:val="single" w:sz="4" w:space="0" w:color="CCCCCC"/>
+          <w:left w:val="single" w:sz="4" w:space="0" w:color="CCCCCC"/>
+          <w:bottom w:val="single" w:sz="4" w:space="0" w:color="CCCCCC"/>
+          <w:right w:val="single" w:sz="4" w:space="0" w:color="CCCCCC"/>
         </w:tblBorders>
-        <w:tblLook w:val="04A0" w:firstRow="1" w:lastRow="0" w:firstColumn="1" w:lastColumn="0" w:noHBand="0" w:noVBand="1"/>
+        <w:tblCellMar>
+          <w:top w:w="80" w:type="dxa"/>
+          <w:start w:w="120" w:type="dxa"/>
+          <w:bottom w:w="80" w:type="dxa"/>
+          <w:end w:w="120" w:type="dxa"/>
+        </w:tblCellMar>
+        <w:tblLook w:val="04A0"/>
       </w:tblPr>
       <w:tblGrid>
+        <w:gridCol w:w="1200"/>
+        <w:gridCol w:w="2200"/>
         <w:gridCol w:w="1100"/>
-        <w:gridCol w:w="2900"/>
-        <w:gridCol w:w="1134"/>
-        <w:gridCol w:w="4600"/>
+        <w:gridCol w:w="2400"/>
       </w:tblGrid>
       <w:tr>
         <w:tc>
           <w:tcPr>
-            <w:tcW w:w="1100" w:type="dxa"/>
-          </w:tcPr>
-          <w:p>
-            <w:pPr>
-              <w:pStyle w:val="TableHeader"/>
-              <w:rPr>
-                <w:b/>
-              </w:rPr>
-            </w:pPr>
+            <w:tcW w:w="1200" w:type="dxa"/>
+            <w:tcBorders>
+              <w:top w:val="single" w:sz="4" w:space="0" w:color="CCCCCC"/>
+              <w:left w:val="single" w:sz="4" w:space="0" w:color="CCCCCC"/>
+              <w:bottom w:val="single" w:sz="4" w:space="0" w:color="CCCCCC"/>
+              <w:right w:val="single" w:sz="4" w:space="0" w:color="CCCCCC"/>
+            </w:tcBorders>
+            <w:shd w:val="clear" w:color="auto" w:fill="D5E8F0"/>
+            <w:tcMar>
+              <w:top w:w="80" w:type="dxa"/>
+              <w:start w:w="120" w:type="dxa"/>
+              <w:bottom w:w="80" w:type="dxa"/>
+              <w:end w:w="120" w:type="dxa"/>
+            </w:tcMar>
+          </w:tcPr>
+          <w:p>
             <w:r>
               <w:rPr>
                 <w:b/>
@@ -1639,15 +2075,22 @@
         </w:tc>
         <w:tc>
           <w:tcPr>
-            <w:tcW w:w="2900" w:type="dxa"/>
-          </w:tcPr>
-          <w:p>
-            <w:pPr>
-              <w:pStyle w:val="TableHeader"/>
-              <w:rPr>
-                <w:b/>
-              </w:rPr>
-            </w:pPr>
+            <w:tcW w:w="2200" w:type="dxa"/>
+            <w:tcBorders>
+              <w:top w:val="single" w:sz="4" w:space="0" w:color="CCCCCC"/>
+              <w:left w:val="single" w:sz="4" w:space="0" w:color="CCCCCC"/>
+              <w:bottom w:val="single" w:sz="4" w:space="0" w:color="CCCCCC"/>
+              <w:right w:val="single" w:sz="4" w:space="0" w:color="CCCCCC"/>
+            </w:tcBorders>
+            <w:shd w:val="clear" w:color="auto" w:fill="D5E8F0"/>
+            <w:tcMar>
+              <w:top w:w="80" w:type="dxa"/>
+              <w:start w:w="120" w:type="dxa"/>
+              <w:bottom w:w="80" w:type="dxa"/>
+              <w:end w:w="120" w:type="dxa"/>
+            </w:tcMar>
+          </w:tcPr>
+          <w:p>
             <w:r>
               <w:rPr>
                 <w:b/>
@@ -1658,15 +2101,22 @@
         </w:tc>
         <w:tc>
           <w:tcPr>
-            <w:tcW w:w="1134" w:type="dxa"/>
-          </w:tcPr>
-          <w:p>
-            <w:pPr>
-              <w:pStyle w:val="TableHeader"/>
-              <w:rPr>
-                <w:b/>
-              </w:rPr>
-            </w:pPr>
+            <w:tcW w:w="1100" w:type="dxa"/>
+            <w:tcBorders>
+              <w:top w:val="single" w:sz="4" w:space="0" w:color="CCCCCC"/>
+              <w:left w:val="single" w:sz="4" w:space="0" w:color="CCCCCC"/>
+              <w:bottom w:val="single" w:sz="4" w:space="0" w:color="CCCCCC"/>
+              <w:right w:val="single" w:sz="4" w:space="0" w:color="CCCCCC"/>
+            </w:tcBorders>
+            <w:shd w:val="clear" w:color="auto" w:fill="D5E8F0"/>
+            <w:tcMar>
+              <w:top w:w="80" w:type="dxa"/>
+              <w:start w:w="120" w:type="dxa"/>
+              <w:bottom w:w="80" w:type="dxa"/>
+              <w:end w:w="120" w:type="dxa"/>
+            </w:tcMar>
+          </w:tcPr>
+          <w:p>
             <w:r>
               <w:rPr>
                 <w:b/>
@@ -1677,15 +2127,22 @@
         </w:tc>
         <w:tc>
           <w:tcPr>
-            <w:tcW w:w="4600" w:type="dxa"/>
-          </w:tcPr>
-          <w:p>
-            <w:pPr>
-              <w:pStyle w:val="TableHeader"/>
-              <w:rPr>
-                <w:b/>
-              </w:rPr>
-            </w:pPr>
+            <w:tcW w:w="2400" w:type="dxa"/>
+            <w:tcBorders>
+              <w:top w:val="single" w:sz="4" w:space="0" w:color="CCCCCC"/>
+              <w:left w:val="single" w:sz="4" w:space="0" w:color="CCCCCC"/>
+              <w:bottom w:val="single" w:sz="4" w:space="0" w:color="CCCCCC"/>
+              <w:right w:val="single" w:sz="4" w:space="0" w:color="CCCCCC"/>
+            </w:tcBorders>
+            <w:shd w:val="clear" w:color="auto" w:fill="D5E8F0"/>
+            <w:tcMar>
+              <w:top w:w="80" w:type="dxa"/>
+              <w:start w:w="120" w:type="dxa"/>
+              <w:bottom w:w="80" w:type="dxa"/>
+              <w:end w:w="120" w:type="dxa"/>
+            </w:tcMar>
+          </w:tcPr>
+          <w:p>
             <w:r>
               <w:rPr>
                 <w:b/>
@@ -1698,38 +2155,65 @@
       <w:tr>
         <w:tc>
           <w:tcPr>
+            <w:tcW w:w="1200" w:type="dxa"/>
+            <w:tcBorders>
+              <w:top w:val="single" w:sz="4" w:space="0" w:color="CCCCCC"/>
+              <w:left w:val="single" w:sz="4" w:space="0" w:color="CCCCCC"/>
+              <w:bottom w:val="single" w:sz="4" w:space="0" w:color="CCCCCC"/>
+              <w:right w:val="single" w:sz="4" w:space="0" w:color="CCCCCC"/>
+            </w:tcBorders>
+            <w:tcMar>
+              <w:top w:w="80" w:type="dxa"/>
+              <w:start w:w="120" w:type="dxa"/>
+              <w:bottom w:w="80" w:type="dxa"/>
+              <w:end w:w="120" w:type="dxa"/>
+            </w:tcMar>
+          </w:tcPr>
+          <w:p>
+            <w:r>
+              <w:t xml:space="preserve">HIGH</w:t>
+            </w:r>
+          </w:p>
+        </w:tc>
+        <w:tc>
+          <w:tcPr>
+            <w:tcW w:w="2200" w:type="dxa"/>
+            <w:tcBorders>
+              <w:top w:val="single" w:sz="4" w:space="0" w:color="CCCCCC"/>
+              <w:left w:val="single" w:sz="4" w:space="0" w:color="CCCCCC"/>
+              <w:bottom w:val="single" w:sz="4" w:space="0" w:color="CCCCCC"/>
+              <w:right w:val="single" w:sz="4" w:space="0" w:color="CCCCCC"/>
+            </w:tcBorders>
+            <w:tcMar>
+              <w:top w:w="80" w:type="dxa"/>
+              <w:start w:w="120" w:type="dxa"/>
+              <w:bottom w:w="80" w:type="dxa"/>
+              <w:end w:w="120" w:type="dxa"/>
+            </w:tcMar>
+          </w:tcPr>
+          <w:p>
+            <w:r>
+              <w:t xml:space="preserve">PDF accessibility</w:t>
+            </w:r>
+          </w:p>
+        </w:tc>
+        <w:tc>
+          <w:tcPr>
             <w:tcW w:w="1100" w:type="dxa"/>
-          </w:tcPr>
-          <w:p>
-            <w:pPr>
-              <w:pStyle w:val="Normal"/>
-            </w:pPr>
-            <w:r>
-              <w:t xml:space="preserve">HIGH</w:t>
-            </w:r>
-          </w:p>
-        </w:tc>
-        <w:tc>
-          <w:tcPr>
-            <w:tcW w:w="2900" w:type="dxa"/>
-          </w:tcPr>
-          <w:p>
-            <w:pPr>
-              <w:pStyle w:val="Normal"/>
-            </w:pPr>
-            <w:r>
-              <w:t xml:space="preserve">PDF accessibility</w:t>
-            </w:r>
-          </w:p>
-        </w:tc>
-        <w:tc>
-          <w:tcPr>
-            <w:tcW w:w="1134" w:type="dxa"/>
-          </w:tcPr>
-          <w:p>
-            <w:pPr>
-              <w:pStyle w:val="Normal"/>
-            </w:pPr>
+            <w:tcBorders>
+              <w:top w:val="single" w:sz="4" w:space="0" w:color="CCCCCC"/>
+              <w:left w:val="single" w:sz="4" w:space="0" w:color="CCCCCC"/>
+              <w:bottom w:val="single" w:sz="4" w:space="0" w:color="CCCCCC"/>
+              <w:right w:val="single" w:sz="4" w:space="0" w:color="CCCCCC"/>
+            </w:tcBorders>
+            <w:tcMar>
+              <w:top w:w="80" w:type="dxa"/>
+              <w:start w:w="120" w:type="dxa"/>
+              <w:bottom w:w="80" w:type="dxa"/>
+              <w:end w:w="120" w:type="dxa"/>
+            </w:tcMar>
+          </w:tcPr>
+          <w:p>
             <w:r>
               <w:t xml:space="preserve">B.1, B.4</w:t>
             </w:r>
@@ -1737,12 +2221,21 @@
         </w:tc>
         <w:tc>
           <w:tcPr>
-            <w:tcW w:w="4600" w:type="dxa"/>
-          </w:tcPr>
-          <w:p>
-            <w:pPr>
-              <w:pStyle w:val="Normal"/>
-            </w:pPr>
+            <w:tcW w:w="2400" w:type="dxa"/>
+            <w:tcBorders>
+              <w:top w:val="single" w:sz="4" w:space="0" w:color="CCCCCC"/>
+              <w:left w:val="single" w:sz="4" w:space="0" w:color="CCCCCC"/>
+              <w:bottom w:val="single" w:sz="4" w:space="0" w:color="CCCCCC"/>
+              <w:right w:val="single" w:sz="4" w:space="0" w:color="CCCCCC"/>
+            </w:tcBorders>
+            <w:tcMar>
+              <w:top w:w="80" w:type="dxa"/>
+              <w:start w:w="120" w:type="dxa"/>
+              <w:bottom w:w="80" w:type="dxa"/>
+              <w:end w:w="120" w:type="dxa"/>
+            </w:tcMar>
+          </w:tcPr>
+          <w:p>
             <w:r>
               <w:t xml:space="preserve">Produce tagged PDF-UA versions of QSG and User Guide; add alt-text to all figures</w:t>
             </w:r>
@@ -1752,38 +2245,65 @@
       <w:tr>
         <w:tc>
           <w:tcPr>
+            <w:tcW w:w="1200" w:type="dxa"/>
+            <w:tcBorders>
+              <w:top w:val="single" w:sz="4" w:space="0" w:color="CCCCCC"/>
+              <w:left w:val="single" w:sz="4" w:space="0" w:color="CCCCCC"/>
+              <w:bottom w:val="single" w:sz="4" w:space="0" w:color="CCCCCC"/>
+              <w:right w:val="single" w:sz="4" w:space="0" w:color="CCCCCC"/>
+            </w:tcBorders>
+            <w:tcMar>
+              <w:top w:w="80" w:type="dxa"/>
+              <w:start w:w="120" w:type="dxa"/>
+              <w:bottom w:w="80" w:type="dxa"/>
+              <w:end w:w="120" w:type="dxa"/>
+            </w:tcMar>
+          </w:tcPr>
+          <w:p>
+            <w:r>
+              <w:t xml:space="preserve">HIGH</w:t>
+            </w:r>
+          </w:p>
+        </w:tc>
+        <w:tc>
+          <w:tcPr>
+            <w:tcW w:w="2200" w:type="dxa"/>
+            <w:tcBorders>
+              <w:top w:val="single" w:sz="4" w:space="0" w:color="CCCCCC"/>
+              <w:left w:val="single" w:sz="4" w:space="0" w:color="CCCCCC"/>
+              <w:bottom w:val="single" w:sz="4" w:space="0" w:color="CCCCCC"/>
+              <w:right w:val="single" w:sz="4" w:space="0" w:color="CCCCCC"/>
+            </w:tcBorders>
+            <w:tcMar>
+              <w:top w:w="80" w:type="dxa"/>
+              <w:start w:w="120" w:type="dxa"/>
+              <w:bottom w:w="80" w:type="dxa"/>
+              <w:end w:w="120" w:type="dxa"/>
+            </w:tcMar>
+          </w:tcPr>
+          <w:p>
+            <w:r>
+              <w:t xml:space="preserve">HTML documentation</w:t>
+            </w:r>
+          </w:p>
+        </w:tc>
+        <w:tc>
+          <w:tcPr>
             <w:tcW w:w="1100" w:type="dxa"/>
-          </w:tcPr>
-          <w:p>
-            <w:pPr>
-              <w:pStyle w:val="Normal"/>
-            </w:pPr>
-            <w:r>
-              <w:t xml:space="preserve">HIGH</w:t>
-            </w:r>
-          </w:p>
-        </w:tc>
-        <w:tc>
-          <w:tcPr>
-            <w:tcW w:w="2900" w:type="dxa"/>
-          </w:tcPr>
-          <w:p>
-            <w:pPr>
-              <w:pStyle w:val="Normal"/>
-            </w:pPr>
-            <w:r>
-              <w:t xml:space="preserve">HTML documentation</w:t>
-            </w:r>
-          </w:p>
-        </w:tc>
-        <w:tc>
-          <w:tcPr>
-            <w:tcW w:w="1134" w:type="dxa"/>
-          </w:tcPr>
-          <w:p>
-            <w:pPr>
-              <w:pStyle w:val="Normal"/>
-            </w:pPr>
+            <w:tcBorders>
+              <w:top w:val="single" w:sz="4" w:space="0" w:color="CCCCCC"/>
+              <w:left w:val="single" w:sz="4" w:space="0" w:color="CCCCCC"/>
+              <w:bottom w:val="single" w:sz="4" w:space="0" w:color="CCCCCC"/>
+              <w:right w:val="single" w:sz="4" w:space="0" w:color="CCCCCC"/>
+            </w:tcBorders>
+            <w:tcMar>
+              <w:top w:w="80" w:type="dxa"/>
+              <w:start w:w="120" w:type="dxa"/>
+              <w:bottom w:w="80" w:type="dxa"/>
+              <w:end w:w="120" w:type="dxa"/>
+            </w:tcMar>
+          </w:tcPr>
+          <w:p>
             <w:r>
               <w:t xml:space="preserve">B.2</w:t>
             </w:r>
@@ -1791,12 +2311,21 @@
         </w:tc>
         <w:tc>
           <w:tcPr>
-            <w:tcW w:w="4600" w:type="dxa"/>
-          </w:tcPr>
-          <w:p>
-            <w:pPr>
-              <w:pStyle w:val="Normal"/>
-            </w:pPr>
+            <w:tcW w:w="2400" w:type="dxa"/>
+            <w:tcBorders>
+              <w:top w:val="single" w:sz="4" w:space="0" w:color="CCCCCC"/>
+              <w:left w:val="single" w:sz="4" w:space="0" w:color="CCCCCC"/>
+              <w:bottom w:val="single" w:sz="4" w:space="0" w:color="CCCCCC"/>
+              <w:right w:val="single" w:sz="4" w:space="0" w:color="CCCCCC"/>
+            </w:tcBorders>
+            <w:tcMar>
+              <w:top w:w="80" w:type="dxa"/>
+              <w:start w:w="120" w:type="dxa"/>
+              <w:bottom w:w="80" w:type="dxa"/>
+              <w:end w:w="120" w:type="dxa"/>
+            </w:tcMar>
+          </w:tcPr>
+          <w:p>
             <w:r>
               <w:t xml:space="preserve">Provide docs in HTML in addition to PDF</w:t>
             </w:r>
@@ -1806,38 +2335,65 @@
       <w:tr>
         <w:tc>
           <w:tcPr>
+            <w:tcW w:w="1200" w:type="dxa"/>
+            <w:tcBorders>
+              <w:top w:val="single" w:sz="4" w:space="0" w:color="CCCCCC"/>
+              <w:left w:val="single" w:sz="4" w:space="0" w:color="CCCCCC"/>
+              <w:bottom w:val="single" w:sz="4" w:space="0" w:color="CCCCCC"/>
+              <w:right w:val="single" w:sz="4" w:space="0" w:color="CCCCCC"/>
+            </w:tcBorders>
+            <w:tcMar>
+              <w:top w:w="80" w:type="dxa"/>
+              <w:start w:w="120" w:type="dxa"/>
+              <w:bottom w:w="80" w:type="dxa"/>
+              <w:end w:w="120" w:type="dxa"/>
+            </w:tcMar>
+          </w:tcPr>
+          <w:p>
+            <w:r>
+              <w:t xml:space="preserve">HIGH</w:t>
+            </w:r>
+          </w:p>
+        </w:tc>
+        <w:tc>
+          <w:tcPr>
+            <w:tcW w:w="2200" w:type="dxa"/>
+            <w:tcBorders>
+              <w:top w:val="single" w:sz="4" w:space="0" w:color="CCCCCC"/>
+              <w:left w:val="single" w:sz="4" w:space="0" w:color="CCCCCC"/>
+              <w:bottom w:val="single" w:sz="4" w:space="0" w:color="CCCCCC"/>
+              <w:right w:val="single" w:sz="4" w:space="0" w:color="CCCCCC"/>
+            </w:tcBorders>
+            <w:tcMar>
+              <w:top w:w="80" w:type="dxa"/>
+              <w:start w:w="120" w:type="dxa"/>
+              <w:bottom w:w="80" w:type="dxa"/>
+              <w:end w:w="120" w:type="dxa"/>
+            </w:tcMar>
+          </w:tcPr>
+          <w:p>
+            <w:r>
+              <w:t xml:space="preserve">Accessibility features section</w:t>
+            </w:r>
+          </w:p>
+        </w:tc>
+        <w:tc>
+          <w:tcPr>
             <w:tcW w:w="1100" w:type="dxa"/>
-          </w:tcPr>
-          <w:p>
-            <w:pPr>
-              <w:pStyle w:val="Normal"/>
-            </w:pPr>
-            <w:r>
-              <w:t xml:space="preserve">HIGH</w:t>
-            </w:r>
-          </w:p>
-        </w:tc>
-        <w:tc>
-          <w:tcPr>
-            <w:tcW w:w="2900" w:type="dxa"/>
-          </w:tcPr>
-          <w:p>
-            <w:pPr>
-              <w:pStyle w:val="Normal"/>
-            </w:pPr>
-            <w:r>
-              <w:t xml:space="preserve">Accessibility features section</w:t>
-            </w:r>
-          </w:p>
-        </w:tc>
-        <w:tc>
-          <w:tcPr>
-            <w:tcW w:w="1134" w:type="dxa"/>
-          </w:tcPr>
-          <w:p>
-            <w:pPr>
-              <w:pStyle w:val="Normal"/>
-            </w:pPr>
+            <w:tcBorders>
+              <w:top w:val="single" w:sz="4" w:space="0" w:color="CCCCCC"/>
+              <w:left w:val="single" w:sz="4" w:space="0" w:color="CCCCCC"/>
+              <w:bottom w:val="single" w:sz="4" w:space="0" w:color="CCCCCC"/>
+              <w:right w:val="single" w:sz="4" w:space="0" w:color="CCCCCC"/>
+            </w:tcBorders>
+            <w:tcMar>
+              <w:top w:w="80" w:type="dxa"/>
+              <w:start w:w="120" w:type="dxa"/>
+              <w:bottom w:w="80" w:type="dxa"/>
+              <w:end w:w="120" w:type="dxa"/>
+            </w:tcMar>
+          </w:tcPr>
+          <w:p>
             <w:r>
               <w:t xml:space="preserve">B.5, B.6</w:t>
             </w:r>
@@ -1845,12 +2401,21 @@
         </w:tc>
         <w:tc>
           <w:tcPr>
-            <w:tcW w:w="4600" w:type="dxa"/>
-          </w:tcPr>
-          <w:p>
-            <w:pPr>
-              <w:pStyle w:val="Normal"/>
-            </w:pPr>
+            <w:tcW w:w="2400" w:type="dxa"/>
+            <w:tcBorders>
+              <w:top w:val="single" w:sz="4" w:space="0" w:color="CCCCCC"/>
+              <w:left w:val="single" w:sz="4" w:space="0" w:color="CCCCCC"/>
+              <w:bottom w:val="single" w:sz="4" w:space="0" w:color="CCCCCC"/>
+              <w:right w:val="single" w:sz="4" w:space="0" w:color="CCCCCC"/>
+            </w:tcBorders>
+            <w:tcMar>
+              <w:top w:w="80" w:type="dxa"/>
+              <w:start w:w="120" w:type="dxa"/>
+              <w:bottom w:w="80" w:type="dxa"/>
+              <w:end w:w="120" w:type="dxa"/>
+            </w:tcMar>
+          </w:tcPr>
+          <w:p>
             <w:r>
               <w:t xml:space="preserve">Document all accessibility features and how to activate them</w:t>
             </w:r>
@@ -1860,38 +2425,65 @@
       <w:tr>
         <w:tc>
           <w:tcPr>
+            <w:tcW w:w="1200" w:type="dxa"/>
+            <w:tcBorders>
+              <w:top w:val="single" w:sz="4" w:space="0" w:color="CCCCCC"/>
+              <w:left w:val="single" w:sz="4" w:space="0" w:color="CCCCCC"/>
+              <w:bottom w:val="single" w:sz="4" w:space="0" w:color="CCCCCC"/>
+              <w:right w:val="single" w:sz="4" w:space="0" w:color="CCCCCC"/>
+            </w:tcBorders>
+            <w:tcMar>
+              <w:top w:w="80" w:type="dxa"/>
+              <w:start w:w="120" w:type="dxa"/>
+              <w:bottom w:w="80" w:type="dxa"/>
+              <w:end w:w="120" w:type="dxa"/>
+            </w:tcMar>
+          </w:tcPr>
+          <w:p>
+            <w:r>
+              <w:t xml:space="preserve">HIGH</w:t>
+            </w:r>
+          </w:p>
+        </w:tc>
+        <w:tc>
+          <w:tcPr>
+            <w:tcW w:w="2200" w:type="dxa"/>
+            <w:tcBorders>
+              <w:top w:val="single" w:sz="4" w:space="0" w:color="CCCCCC"/>
+              <w:left w:val="single" w:sz="4" w:space="0" w:color="CCCCCC"/>
+              <w:bottom w:val="single" w:sz="4" w:space="0" w:color="CCCCCC"/>
+              <w:right w:val="single" w:sz="4" w:space="0" w:color="CCCCCC"/>
+            </w:tcBorders>
+            <w:tcMar>
+              <w:top w:w="80" w:type="dxa"/>
+              <w:start w:w="120" w:type="dxa"/>
+              <w:bottom w:w="80" w:type="dxa"/>
+              <w:end w:w="120" w:type="dxa"/>
+            </w:tcMar>
+          </w:tcPr>
+          <w:p>
+            <w:r>
+              <w:t xml:space="preserve">High Contrast Mode guide</w:t>
+            </w:r>
+          </w:p>
+        </w:tc>
+        <w:tc>
+          <w:tcPr>
             <w:tcW w:w="1100" w:type="dxa"/>
-          </w:tcPr>
-          <w:p>
-            <w:pPr>
-              <w:pStyle w:val="Normal"/>
-            </w:pPr>
-            <w:r>
-              <w:t xml:space="preserve">HIGH</w:t>
-            </w:r>
-          </w:p>
-        </w:tc>
-        <w:tc>
-          <w:tcPr>
-            <w:tcW w:w="2900" w:type="dxa"/>
-          </w:tcPr>
-          <w:p>
-            <w:pPr>
-              <w:pStyle w:val="Normal"/>
-            </w:pPr>
-            <w:r>
-              <w:t xml:space="preserve">High Contrast Mode guide</w:t>
-            </w:r>
-          </w:p>
-        </w:tc>
-        <w:tc>
-          <w:tcPr>
-            <w:tcW w:w="1134" w:type="dxa"/>
-          </w:tcPr>
-          <w:p>
-            <w:pPr>
-              <w:pStyle w:val="Normal"/>
-            </w:pPr>
+            <w:tcBorders>
+              <w:top w:val="single" w:sz="4" w:space="0" w:color="CCCCCC"/>
+              <w:left w:val="single" w:sz="4" w:space="0" w:color="CCCCCC"/>
+              <w:bottom w:val="single" w:sz="4" w:space="0" w:color="CCCCCC"/>
+              <w:right w:val="single" w:sz="4" w:space="0" w:color="CCCCCC"/>
+            </w:tcBorders>
+            <w:tcMar>
+              <w:top w:w="80" w:type="dxa"/>
+              <w:start w:w="120" w:type="dxa"/>
+              <w:bottom w:w="80" w:type="dxa"/>
+              <w:end w:w="120" w:type="dxa"/>
+            </w:tcMar>
+          </w:tcPr>
+          <w:p>
             <w:r>
               <w:t xml:space="preserve">B.5, C.7</w:t>
             </w:r>
@@ -1899,12 +2491,21 @@
         </w:tc>
         <w:tc>
           <w:tcPr>
-            <w:tcW w:w="4600" w:type="dxa"/>
-          </w:tcPr>
-          <w:p>
-            <w:pPr>
-              <w:pStyle w:val="Normal"/>
-            </w:pPr>
+            <w:tcW w:w="2400" w:type="dxa"/>
+            <w:tcBorders>
+              <w:top w:val="single" w:sz="4" w:space="0" w:color="CCCCCC"/>
+              <w:left w:val="single" w:sz="4" w:space="0" w:color="CCCCCC"/>
+              <w:bottom w:val="single" w:sz="4" w:space="0" w:color="CCCCCC"/>
+              <w:right w:val="single" w:sz="4" w:space="0" w:color="CCCCCC"/>
+            </w:tcBorders>
+            <w:tcMar>
+              <w:top w:w="80" w:type="dxa"/>
+              <w:start w:w="120" w:type="dxa"/>
+              <w:bottom w:w="80" w:type="dxa"/>
+              <w:end w:w="120" w:type="dxa"/>
+            </w:tcMar>
+          </w:tcPr>
+          <w:p>
             <w:r>
               <w:t xml:space="preserve">Document OS HC mode activation: Windows Settings &gt; Accessibility &gt; Contrast themes</w:t>
             </w:r>
@@ -1914,38 +2515,65 @@
       <w:tr>
         <w:tc>
           <w:tcPr>
+            <w:tcW w:w="1200" w:type="dxa"/>
+            <w:tcBorders>
+              <w:top w:val="single" w:sz="4" w:space="0" w:color="CCCCCC"/>
+              <w:left w:val="single" w:sz="4" w:space="0" w:color="CCCCCC"/>
+              <w:bottom w:val="single" w:sz="4" w:space="0" w:color="CCCCCC"/>
+              <w:right w:val="single" w:sz="4" w:space="0" w:color="CCCCCC"/>
+            </w:tcBorders>
+            <w:tcMar>
+              <w:top w:w="80" w:type="dxa"/>
+              <w:start w:w="120" w:type="dxa"/>
+              <w:bottom w:w="80" w:type="dxa"/>
+              <w:end w:w="120" w:type="dxa"/>
+            </w:tcMar>
+          </w:tcPr>
+          <w:p>
+            <w:r>
+              <w:t xml:space="preserve">HIGH</w:t>
+            </w:r>
+          </w:p>
+        </w:tc>
+        <w:tc>
+          <w:tcPr>
+            <w:tcW w:w="2200" w:type="dxa"/>
+            <w:tcBorders>
+              <w:top w:val="single" w:sz="4" w:space="0" w:color="CCCCCC"/>
+              <w:left w:val="single" w:sz="4" w:space="0" w:color="CCCCCC"/>
+              <w:bottom w:val="single" w:sz="4" w:space="0" w:color="CCCCCC"/>
+              <w:right w:val="single" w:sz="4" w:space="0" w:color="CCCCCC"/>
+            </w:tcBorders>
+            <w:tcMar>
+              <w:top w:w="80" w:type="dxa"/>
+              <w:start w:w="120" w:type="dxa"/>
+              <w:bottom w:w="80" w:type="dxa"/>
+              <w:end w:w="120" w:type="dxa"/>
+            </w:tcMar>
+          </w:tcPr>
+          <w:p>
+            <w:r>
+              <w:t xml:space="preserve">Assistive technology list</w:t>
+            </w:r>
+          </w:p>
+        </w:tc>
+        <w:tc>
+          <w:tcPr>
             <w:tcW w:w="1100" w:type="dxa"/>
-          </w:tcPr>
-          <w:p>
-            <w:pPr>
-              <w:pStyle w:val="Normal"/>
-            </w:pPr>
-            <w:r>
-              <w:t xml:space="preserve">HIGH</w:t>
-            </w:r>
-          </w:p>
-        </w:tc>
-        <w:tc>
-          <w:tcPr>
-            <w:tcW w:w="2900" w:type="dxa"/>
-          </w:tcPr>
-          <w:p>
-            <w:pPr>
-              <w:pStyle w:val="Normal"/>
-            </w:pPr>
-            <w:r>
-              <w:t xml:space="preserve">Assistive technology list</w:t>
-            </w:r>
-          </w:p>
-        </w:tc>
-        <w:tc>
-          <w:tcPr>
-            <w:tcW w:w="1134" w:type="dxa"/>
-          </w:tcPr>
-          <w:p>
-            <w:pPr>
-              <w:pStyle w:val="Normal"/>
-            </w:pPr>
+            <w:tcBorders>
+              <w:top w:val="single" w:sz="4" w:space="0" w:color="CCCCCC"/>
+              <w:left w:val="single" w:sz="4" w:space="0" w:color="CCCCCC"/>
+              <w:bottom w:val="single" w:sz="4" w:space="0" w:color="CCCCCC"/>
+              <w:right w:val="single" w:sz="4" w:space="0" w:color="CCCCCC"/>
+            </w:tcBorders>
+            <w:tcMar>
+              <w:top w:w="80" w:type="dxa"/>
+              <w:start w:w="120" w:type="dxa"/>
+              <w:bottom w:w="80" w:type="dxa"/>
+              <w:end w:w="120" w:type="dxa"/>
+            </w:tcMar>
+          </w:tcPr>
+          <w:p>
             <w:r>
               <w:t xml:space="preserve">B.7</w:t>
             </w:r>
@@ -1953,12 +2581,21 @@
         </w:tc>
         <w:tc>
           <w:tcPr>
-            <w:tcW w:w="4600" w:type="dxa"/>
-          </w:tcPr>
-          <w:p>
-            <w:pPr>
-              <w:pStyle w:val="Normal"/>
-            </w:pPr>
+            <w:tcW w:w="2400" w:type="dxa"/>
+            <w:tcBorders>
+              <w:top w:val="single" w:sz="4" w:space="0" w:color="CCCCCC"/>
+              <w:left w:val="single" w:sz="4" w:space="0" w:color="CCCCCC"/>
+              <w:bottom w:val="single" w:sz="4" w:space="0" w:color="CCCCCC"/>
+              <w:right w:val="single" w:sz="4" w:space="0" w:color="CCCCCC"/>
+            </w:tcBorders>
+            <w:tcMar>
+              <w:top w:w="80" w:type="dxa"/>
+              <w:start w:w="120" w:type="dxa"/>
+              <w:bottom w:w="80" w:type="dxa"/>
+              <w:end w:w="120" w:type="dxa"/>
+            </w:tcMar>
+          </w:tcPr>
+          <w:p>
             <w:r>
               <w:t xml:space="preserve">List of screen readers and other AT tested with the WebUI</w:t>
             </w:r>
@@ -1976,41 +2613,51 @@
         <w:pStyle w:val="Heading2"/>
       </w:pPr>
       <w:r>
-        <w:t>Hardware / RF</w:t>
+        <w:t xml:space="preserve">Hardware / RF</w:t>
       </w:r>
     </w:p>
     <w:tbl>
       <w:tblPr>
-        <w:tblStyle w:val="TableGrid"/>
-        <w:tblW w:w="9734" w:type="dxa"/>
+        <w:tblW w:w="6900" w:type="dxa"/>
         <w:tblBorders>
-          <w:top w:val="single" w:sz="4" w:space="0" w:color="auto"/>
-          <w:left w:val="single" w:sz="4" w:space="0" w:color="auto"/>
-          <w:bottom w:val="single" w:sz="4" w:space="0" w:color="auto"/>
-          <w:right w:val="single" w:sz="4" w:space="0" w:color="auto"/>
-          <w:insideH w:val="single" w:sz="4" w:space="0" w:color="auto"/>
-          <w:insideV w:val="single" w:sz="4" w:space="0" w:color="auto"/>
+          <w:top w:val="single" w:sz="4" w:space="0" w:color="CCCCCC"/>
+          <w:left w:val="single" w:sz="4" w:space="0" w:color="CCCCCC"/>
+          <w:bottom w:val="single" w:sz="4" w:space="0" w:color="CCCCCC"/>
+          <w:right w:val="single" w:sz="4" w:space="0" w:color="CCCCCC"/>
         </w:tblBorders>
-        <w:tblLook w:val="04A0" w:firstRow="1" w:lastRow="0" w:firstColumn="1" w:lastColumn="0" w:noHBand="0" w:noVBand="1"/>
+        <w:tblCellMar>
+          <w:top w:w="80" w:type="dxa"/>
+          <w:start w:w="120" w:type="dxa"/>
+          <w:bottom w:w="80" w:type="dxa"/>
+          <w:end w:w="120" w:type="dxa"/>
+        </w:tblCellMar>
+        <w:tblLook w:val="04A0"/>
       </w:tblPr>
       <w:tblGrid>
+        <w:gridCol w:w="1200"/>
+        <w:gridCol w:w="2200"/>
         <w:gridCol w:w="1100"/>
-        <w:gridCol w:w="2900"/>
-        <w:gridCol w:w="1134"/>
-        <w:gridCol w:w="4600"/>
+        <w:gridCol w:w="2400"/>
       </w:tblGrid>
       <w:tr>
         <w:tc>
           <w:tcPr>
-            <w:tcW w:w="1100" w:type="dxa"/>
-          </w:tcPr>
-          <w:p>
-            <w:pPr>
-              <w:pStyle w:val="TableHeader"/>
-              <w:rPr>
-                <w:b/>
-              </w:rPr>
-            </w:pPr>
+            <w:tcW w:w="1200" w:type="dxa"/>
+            <w:tcBorders>
+              <w:top w:val="single" w:sz="4" w:space="0" w:color="CCCCCC"/>
+              <w:left w:val="single" w:sz="4" w:space="0" w:color="CCCCCC"/>
+              <w:bottom w:val="single" w:sz="4" w:space="0" w:color="CCCCCC"/>
+              <w:right w:val="single" w:sz="4" w:space="0" w:color="CCCCCC"/>
+            </w:tcBorders>
+            <w:shd w:val="clear" w:color="auto" w:fill="D5E8F0"/>
+            <w:tcMar>
+              <w:top w:w="80" w:type="dxa"/>
+              <w:start w:w="120" w:type="dxa"/>
+              <w:bottom w:w="80" w:type="dxa"/>
+              <w:end w:w="120" w:type="dxa"/>
+            </w:tcMar>
+          </w:tcPr>
+          <w:p>
             <w:r>
               <w:rPr>
                 <w:b/>
@@ -2021,15 +2668,22 @@
         </w:tc>
         <w:tc>
           <w:tcPr>
-            <w:tcW w:w="2900" w:type="dxa"/>
-          </w:tcPr>
-          <w:p>
-            <w:pPr>
-              <w:pStyle w:val="TableHeader"/>
-              <w:rPr>
-                <w:b/>
-              </w:rPr>
-            </w:pPr>
+            <w:tcW w:w="2200" w:type="dxa"/>
+            <w:tcBorders>
+              <w:top w:val="single" w:sz="4" w:space="0" w:color="CCCCCC"/>
+              <w:left w:val="single" w:sz="4" w:space="0" w:color="CCCCCC"/>
+              <w:bottom w:val="single" w:sz="4" w:space="0" w:color="CCCCCC"/>
+              <w:right w:val="single" w:sz="4" w:space="0" w:color="CCCCCC"/>
+            </w:tcBorders>
+            <w:shd w:val="clear" w:color="auto" w:fill="D5E8F0"/>
+            <w:tcMar>
+              <w:top w:w="80" w:type="dxa"/>
+              <w:start w:w="120" w:type="dxa"/>
+              <w:bottom w:w="80" w:type="dxa"/>
+              <w:end w:w="120" w:type="dxa"/>
+            </w:tcMar>
+          </w:tcPr>
+          <w:p>
             <w:r>
               <w:rPr>
                 <w:b/>
@@ -2040,15 +2694,22 @@
         </w:tc>
         <w:tc>
           <w:tcPr>
-            <w:tcW w:w="1134" w:type="dxa"/>
-          </w:tcPr>
-          <w:p>
-            <w:pPr>
-              <w:pStyle w:val="TableHeader"/>
-              <w:rPr>
-                <w:b/>
-              </w:rPr>
-            </w:pPr>
+            <w:tcW w:w="1100" w:type="dxa"/>
+            <w:tcBorders>
+              <w:top w:val="single" w:sz="4" w:space="0" w:color="CCCCCC"/>
+              <w:left w:val="single" w:sz="4" w:space="0" w:color="CCCCCC"/>
+              <w:bottom w:val="single" w:sz="4" w:space="0" w:color="CCCCCC"/>
+              <w:right w:val="single" w:sz="4" w:space="0" w:color="CCCCCC"/>
+            </w:tcBorders>
+            <w:shd w:val="clear" w:color="auto" w:fill="D5E8F0"/>
+            <w:tcMar>
+              <w:top w:w="80" w:type="dxa"/>
+              <w:start w:w="120" w:type="dxa"/>
+              <w:bottom w:w="80" w:type="dxa"/>
+              <w:end w:w="120" w:type="dxa"/>
+            </w:tcMar>
+          </w:tcPr>
+          <w:p>
             <w:r>
               <w:rPr>
                 <w:b/>
@@ -2059,15 +2720,22 @@
         </w:tc>
         <w:tc>
           <w:tcPr>
-            <w:tcW w:w="4600" w:type="dxa"/>
-          </w:tcPr>
-          <w:p>
-            <w:pPr>
-              <w:pStyle w:val="TableHeader"/>
-              <w:rPr>
-                <w:b/>
-              </w:rPr>
-            </w:pPr>
+            <w:tcW w:w="2400" w:type="dxa"/>
+            <w:tcBorders>
+              <w:top w:val="single" w:sz="4" w:space="0" w:color="CCCCCC"/>
+              <w:left w:val="single" w:sz="4" w:space="0" w:color="CCCCCC"/>
+              <w:bottom w:val="single" w:sz="4" w:space="0" w:color="CCCCCC"/>
+              <w:right w:val="single" w:sz="4" w:space="0" w:color="CCCCCC"/>
+            </w:tcBorders>
+            <w:shd w:val="clear" w:color="auto" w:fill="D5E8F0"/>
+            <w:tcMar>
+              <w:top w:w="80" w:type="dxa"/>
+              <w:start w:w="120" w:type="dxa"/>
+              <w:bottom w:w="80" w:type="dxa"/>
+              <w:end w:w="120" w:type="dxa"/>
+            </w:tcMar>
+          </w:tcPr>
+          <w:p>
             <w:r>
               <w:rPr>
                 <w:b/>
@@ -2080,38 +2748,65 @@
       <w:tr>
         <w:tc>
           <w:tcPr>
+            <w:tcW w:w="1200" w:type="dxa"/>
+            <w:tcBorders>
+              <w:top w:val="single" w:sz="4" w:space="0" w:color="CCCCCC"/>
+              <w:left w:val="single" w:sz="4" w:space="0" w:color="CCCCCC"/>
+              <w:bottom w:val="single" w:sz="4" w:space="0" w:color="CCCCCC"/>
+              <w:right w:val="single" w:sz="4" w:space="0" w:color="CCCCCC"/>
+            </w:tcBorders>
+            <w:tcMar>
+              <w:top w:w="80" w:type="dxa"/>
+              <w:start w:w="120" w:type="dxa"/>
+              <w:bottom w:w="80" w:type="dxa"/>
+              <w:end w:w="120" w:type="dxa"/>
+            </w:tcMar>
+          </w:tcPr>
+          <w:p>
+            <w:r>
+              <w:t xml:space="preserve">CRITICAL</w:t>
+            </w:r>
+          </w:p>
+        </w:tc>
+        <w:tc>
+          <w:tcPr>
+            <w:tcW w:w="2200" w:type="dxa"/>
+            <w:tcBorders>
+              <w:top w:val="single" w:sz="4" w:space="0" w:color="CCCCCC"/>
+              <w:left w:val="single" w:sz="4" w:space="0" w:color="CCCCCC"/>
+              <w:bottom w:val="single" w:sz="4" w:space="0" w:color="CCCCCC"/>
+              <w:right w:val="single" w:sz="4" w:space="0" w:color="CCCCCC"/>
+            </w:tcBorders>
+            <w:tcMar>
+              <w:top w:w="80" w:type="dxa"/>
+              <w:start w:w="120" w:type="dxa"/>
+              <w:bottom w:w="80" w:type="dxa"/>
+              <w:end w:w="120" w:type="dxa"/>
+            </w:tcMar>
+          </w:tcPr>
+          <w:p>
+            <w:r>
+              <w:t xml:space="preserve">Hearing aid interference testing</w:t>
+            </w:r>
+          </w:p>
+        </w:tc>
+        <w:tc>
+          <w:tcPr>
             <w:tcW w:w="1100" w:type="dxa"/>
-          </w:tcPr>
-          <w:p>
-            <w:pPr>
-              <w:pStyle w:val="Normal"/>
-            </w:pPr>
-            <w:r>
-              <w:t xml:space="preserve">CRITICAL</w:t>
-            </w:r>
-          </w:p>
-        </w:tc>
-        <w:tc>
-          <w:tcPr>
-            <w:tcW w:w="2900" w:type="dxa"/>
-          </w:tcPr>
-          <w:p>
-            <w:pPr>
-              <w:pStyle w:val="Normal"/>
-            </w:pPr>
-            <w:r>
-              <w:t xml:space="preserve">Hearing aid interference testing</w:t>
-            </w:r>
-          </w:p>
-        </w:tc>
-        <w:tc>
-          <w:tcPr>
-            <w:tcW w:w="1134" w:type="dxa"/>
-          </w:tcPr>
-          <w:p>
-            <w:pPr>
-              <w:pStyle w:val="Normal"/>
-            </w:pPr>
+            <w:tcBorders>
+              <w:top w:val="single" w:sz="4" w:space="0" w:color="CCCCCC"/>
+              <w:left w:val="single" w:sz="4" w:space="0" w:color="CCCCCC"/>
+              <w:bottom w:val="single" w:sz="4" w:space="0" w:color="CCCCCC"/>
+              <w:right w:val="single" w:sz="4" w:space="0" w:color="CCCCCC"/>
+            </w:tcBorders>
+            <w:tcMar>
+              <w:top w:w="80" w:type="dxa"/>
+              <w:start w:w="120" w:type="dxa"/>
+              <w:bottom w:w="80" w:type="dxa"/>
+              <w:end w:w="120" w:type="dxa"/>
+            </w:tcMar>
+          </w:tcPr>
+          <w:p>
             <w:r>
               <w:t xml:space="preserve">E.1</w:t>
             </w:r>
@@ -2119,12 +2814,21 @@
         </w:tc>
         <w:tc>
           <w:tcPr>
-            <w:tcW w:w="4600" w:type="dxa"/>
-          </w:tcPr>
-          <w:p>
-            <w:pPr>
-              <w:pStyle w:val="Normal"/>
-            </w:pPr>
+            <w:tcW w:w="2400" w:type="dxa"/>
+            <w:tcBorders>
+              <w:top w:val="single" w:sz="4" w:space="0" w:color="CCCCCC"/>
+              <w:left w:val="single" w:sz="4" w:space="0" w:color="CCCCCC"/>
+              <w:bottom w:val="single" w:sz="4" w:space="0" w:color="CCCCCC"/>
+              <w:right w:val="single" w:sz="4" w:space="0" w:color="CCCCCC"/>
+            </w:tcBorders>
+            <w:tcMar>
+              <w:top w:w="80" w:type="dxa"/>
+              <w:start w:w="120" w:type="dxa"/>
+              <w:bottom w:w="80" w:type="dxa"/>
+              <w:end w:w="120" w:type="dxa"/>
+            </w:tcMar>
+          </w:tcPr>
+          <w:p>
             <w:r>
               <w:t xml:space="preserve">Commission EN 301 489-17 testing -- no evidence of compliance on file</w:t>
             </w:r>
@@ -2142,41 +2846,51 @@
         <w:pStyle w:val="Heading2"/>
       </w:pPr>
       <w:r>
-        <w:t>Support / Marketing</w:t>
+        <w:t xml:space="preserve">Support / Marketing</w:t>
       </w:r>
     </w:p>
     <w:tbl>
       <w:tblPr>
-        <w:tblStyle w:val="TableGrid"/>
-        <w:tblW w:w="9734" w:type="dxa"/>
+        <w:tblW w:w="6900" w:type="dxa"/>
         <w:tblBorders>
-          <w:top w:val="single" w:sz="4" w:space="0" w:color="auto"/>
-          <w:left w:val="single" w:sz="4" w:space="0" w:color="auto"/>
-          <w:bottom w:val="single" w:sz="4" w:space="0" w:color="auto"/>
-          <w:right w:val="single" w:sz="4" w:space="0" w:color="auto"/>
-          <w:insideH w:val="single" w:sz="4" w:space="0" w:color="auto"/>
-          <w:insideV w:val="single" w:sz="4" w:space="0" w:color="auto"/>
+          <w:top w:val="single" w:sz="4" w:space="0" w:color="CCCCCC"/>
+          <w:left w:val="single" w:sz="4" w:space="0" w:color="CCCCCC"/>
+          <w:bottom w:val="single" w:sz="4" w:space="0" w:color="CCCCCC"/>
+          <w:right w:val="single" w:sz="4" w:space="0" w:color="CCCCCC"/>
         </w:tblBorders>
-        <w:tblLook w:val="04A0" w:firstRow="1" w:lastRow="0" w:firstColumn="1" w:lastColumn="0" w:noHBand="0" w:noVBand="1"/>
+        <w:tblCellMar>
+          <w:top w:w="80" w:type="dxa"/>
+          <w:start w:w="120" w:type="dxa"/>
+          <w:bottom w:w="80" w:type="dxa"/>
+          <w:end w:w="120" w:type="dxa"/>
+        </w:tblCellMar>
+        <w:tblLook w:val="04A0"/>
       </w:tblPr>
       <w:tblGrid>
+        <w:gridCol w:w="1200"/>
+        <w:gridCol w:w="2200"/>
         <w:gridCol w:w="1100"/>
-        <w:gridCol w:w="2900"/>
-        <w:gridCol w:w="1134"/>
-        <w:gridCol w:w="4600"/>
+        <w:gridCol w:w="2400"/>
       </w:tblGrid>
       <w:tr>
         <w:tc>
           <w:tcPr>
-            <w:tcW w:w="1100" w:type="dxa"/>
-          </w:tcPr>
-          <w:p>
-            <w:pPr>
-              <w:pStyle w:val="TableHeader"/>
-              <w:rPr>
-                <w:b/>
-              </w:rPr>
-            </w:pPr>
+            <w:tcW w:w="1200" w:type="dxa"/>
+            <w:tcBorders>
+              <w:top w:val="single" w:sz="4" w:space="0" w:color="CCCCCC"/>
+              <w:left w:val="single" w:sz="4" w:space="0" w:color="CCCCCC"/>
+              <w:bottom w:val="single" w:sz="4" w:space="0" w:color="CCCCCC"/>
+              <w:right w:val="single" w:sz="4" w:space="0" w:color="CCCCCC"/>
+            </w:tcBorders>
+            <w:shd w:val="clear" w:color="auto" w:fill="D5E8F0"/>
+            <w:tcMar>
+              <w:top w:w="80" w:type="dxa"/>
+              <w:start w:w="120" w:type="dxa"/>
+              <w:bottom w:w="80" w:type="dxa"/>
+              <w:end w:w="120" w:type="dxa"/>
+            </w:tcMar>
+          </w:tcPr>
+          <w:p>
             <w:r>
               <w:rPr>
                 <w:b/>
@@ -2187,15 +2901,22 @@
         </w:tc>
         <w:tc>
           <w:tcPr>
-            <w:tcW w:w="2900" w:type="dxa"/>
-          </w:tcPr>
-          <w:p>
-            <w:pPr>
-              <w:pStyle w:val="TableHeader"/>
-              <w:rPr>
-                <w:b/>
-              </w:rPr>
-            </w:pPr>
+            <w:tcW w:w="2200" w:type="dxa"/>
+            <w:tcBorders>
+              <w:top w:val="single" w:sz="4" w:space="0" w:color="CCCCCC"/>
+              <w:left w:val="single" w:sz="4" w:space="0" w:color="CCCCCC"/>
+              <w:bottom w:val="single" w:sz="4" w:space="0" w:color="CCCCCC"/>
+              <w:right w:val="single" w:sz="4" w:space="0" w:color="CCCCCC"/>
+            </w:tcBorders>
+            <w:shd w:val="clear" w:color="auto" w:fill="D5E8F0"/>
+            <w:tcMar>
+              <w:top w:w="80" w:type="dxa"/>
+              <w:start w:w="120" w:type="dxa"/>
+              <w:bottom w:w="80" w:type="dxa"/>
+              <w:end w:w="120" w:type="dxa"/>
+            </w:tcMar>
+          </w:tcPr>
+          <w:p>
             <w:r>
               <w:rPr>
                 <w:b/>
@@ -2206,15 +2927,22 @@
         </w:tc>
         <w:tc>
           <w:tcPr>
-            <w:tcW w:w="1134" w:type="dxa"/>
-          </w:tcPr>
-          <w:p>
-            <w:pPr>
-              <w:pStyle w:val="TableHeader"/>
-              <w:rPr>
-                <w:b/>
-              </w:rPr>
-            </w:pPr>
+            <w:tcW w:w="1100" w:type="dxa"/>
+            <w:tcBorders>
+              <w:top w:val="single" w:sz="4" w:space="0" w:color="CCCCCC"/>
+              <w:left w:val="single" w:sz="4" w:space="0" w:color="CCCCCC"/>
+              <w:bottom w:val="single" w:sz="4" w:space="0" w:color="CCCCCC"/>
+              <w:right w:val="single" w:sz="4" w:space="0" w:color="CCCCCC"/>
+            </w:tcBorders>
+            <w:shd w:val="clear" w:color="auto" w:fill="D5E8F0"/>
+            <w:tcMar>
+              <w:top w:w="80" w:type="dxa"/>
+              <w:start w:w="120" w:type="dxa"/>
+              <w:bottom w:w="80" w:type="dxa"/>
+              <w:end w:w="120" w:type="dxa"/>
+            </w:tcMar>
+          </w:tcPr>
+          <w:p>
             <w:r>
               <w:rPr>
                 <w:b/>
@@ -2225,15 +2953,22 @@
         </w:tc>
         <w:tc>
           <w:tcPr>
-            <w:tcW w:w="4600" w:type="dxa"/>
-          </w:tcPr>
-          <w:p>
-            <w:pPr>
-              <w:pStyle w:val="TableHeader"/>
-              <w:rPr>
-                <w:b/>
-              </w:rPr>
-            </w:pPr>
+            <w:tcW w:w="2400" w:type="dxa"/>
+            <w:tcBorders>
+              <w:top w:val="single" w:sz="4" w:space="0" w:color="CCCCCC"/>
+              <w:left w:val="single" w:sz="4" w:space="0" w:color="CCCCCC"/>
+              <w:bottom w:val="single" w:sz="4" w:space="0" w:color="CCCCCC"/>
+              <w:right w:val="single" w:sz="4" w:space="0" w:color="CCCCCC"/>
+            </w:tcBorders>
+            <w:shd w:val="clear" w:color="auto" w:fill="D5E8F0"/>
+            <w:tcMar>
+              <w:top w:w="80" w:type="dxa"/>
+              <w:start w:w="120" w:type="dxa"/>
+              <w:bottom w:w="80" w:type="dxa"/>
+              <w:end w:w="120" w:type="dxa"/>
+            </w:tcMar>
+          </w:tcPr>
+          <w:p>
             <w:r>
               <w:rPr>
                 <w:b/>
@@ -2246,38 +2981,65 @@
       <w:tr>
         <w:tc>
           <w:tcPr>
+            <w:tcW w:w="1200" w:type="dxa"/>
+            <w:tcBorders>
+              <w:top w:val="single" w:sz="4" w:space="0" w:color="CCCCCC"/>
+              <w:left w:val="single" w:sz="4" w:space="0" w:color="CCCCCC"/>
+              <w:bottom w:val="single" w:sz="4" w:space="0" w:color="CCCCCC"/>
+              <w:right w:val="single" w:sz="4" w:space="0" w:color="CCCCCC"/>
+            </w:tcBorders>
+            <w:tcMar>
+              <w:top w:w="80" w:type="dxa"/>
+              <w:start w:w="120" w:type="dxa"/>
+              <w:bottom w:w="80" w:type="dxa"/>
+              <w:end w:w="120" w:type="dxa"/>
+            </w:tcMar>
+          </w:tcPr>
+          <w:p>
+            <w:r>
+              <w:t xml:space="preserve">MEDIUM</w:t>
+            </w:r>
+          </w:p>
+        </w:tc>
+        <w:tc>
+          <w:tcPr>
+            <w:tcW w:w="2200" w:type="dxa"/>
+            <w:tcBorders>
+              <w:top w:val="single" w:sz="4" w:space="0" w:color="CCCCCC"/>
+              <w:left w:val="single" w:sz="4" w:space="0" w:color="CCCCCC"/>
+              <w:bottom w:val="single" w:sz="4" w:space="0" w:color="CCCCCC"/>
+              <w:right w:val="single" w:sz="4" w:space="0" w:color="CCCCCC"/>
+            </w:tcBorders>
+            <w:tcMar>
+              <w:top w:w="80" w:type="dxa"/>
+              <w:start w:w="120" w:type="dxa"/>
+              <w:bottom w:w="80" w:type="dxa"/>
+              <w:end w:w="120" w:type="dxa"/>
+            </w:tcMar>
+          </w:tcPr>
+          <w:p>
+            <w:r>
+              <w:t xml:space="preserve">Accessibility statement</w:t>
+            </w:r>
+          </w:p>
+        </w:tc>
+        <w:tc>
+          <w:tcPr>
             <w:tcW w:w="1100" w:type="dxa"/>
-          </w:tcPr>
-          <w:p>
-            <w:pPr>
-              <w:pStyle w:val="Normal"/>
-            </w:pPr>
-            <w:r>
-              <w:t xml:space="preserve">MEDIUM</w:t>
-            </w:r>
-          </w:p>
-        </w:tc>
-        <w:tc>
-          <w:tcPr>
-            <w:tcW w:w="2900" w:type="dxa"/>
-          </w:tcPr>
-          <w:p>
-            <w:pPr>
-              <w:pStyle w:val="Normal"/>
-            </w:pPr>
-            <w:r>
-              <w:t xml:space="preserve">Accessibility statement</w:t>
-            </w:r>
-          </w:p>
-        </w:tc>
-        <w:tc>
-          <w:tcPr>
-            <w:tcW w:w="1134" w:type="dxa"/>
-          </w:tcPr>
-          <w:p>
-            <w:pPr>
-              <w:pStyle w:val="Normal"/>
-            </w:pPr>
+            <w:tcBorders>
+              <w:top w:val="single" w:sz="4" w:space="0" w:color="CCCCCC"/>
+              <w:left w:val="single" w:sz="4" w:space="0" w:color="CCCCCC"/>
+              <w:bottom w:val="single" w:sz="4" w:space="0" w:color="CCCCCC"/>
+              <w:right w:val="single" w:sz="4" w:space="0" w:color="CCCCCC"/>
+            </w:tcBorders>
+            <w:tcMar>
+              <w:top w:w="80" w:type="dxa"/>
+              <w:start w:w="120" w:type="dxa"/>
+              <w:bottom w:w="80" w:type="dxa"/>
+              <w:end w:w="120" w:type="dxa"/>
+            </w:tcMar>
+          </w:tcPr>
+          <w:p>
             <w:r>
               <w:t xml:space="preserve">F.1</w:t>
             </w:r>
@@ -2285,12 +3047,21 @@
         </w:tc>
         <w:tc>
           <w:tcPr>
-            <w:tcW w:w="4600" w:type="dxa"/>
-          </w:tcPr>
-          <w:p>
-            <w:pPr>
-              <w:pStyle w:val="Normal"/>
-            </w:pPr>
+            <w:tcW w:w="2400" w:type="dxa"/>
+            <w:tcBorders>
+              <w:top w:val="single" w:sz="4" w:space="0" w:color="CCCCCC"/>
+              <w:left w:val="single" w:sz="4" w:space="0" w:color="CCCCCC"/>
+              <w:bottom w:val="single" w:sz="4" w:space="0" w:color="CCCCCC"/>
+              <w:right w:val="single" w:sz="4" w:space="0" w:color="CCCCCC"/>
+            </w:tcBorders>
+            <w:tcMar>
+              <w:top w:w="80" w:type="dxa"/>
+              <w:start w:w="120" w:type="dxa"/>
+              <w:bottom w:w="80" w:type="dxa"/>
+              <w:end w:w="120" w:type="dxa"/>
+            </w:tcMar>
+          </w:tcPr>
+          <w:p>
             <w:r>
               <w:t xml:space="preserve">Add accessibility information and contact to support pages</w:t>
             </w:r>
@@ -2300,38 +3071,65 @@
       <w:tr>
         <w:tc>
           <w:tcPr>
+            <w:tcW w:w="1200" w:type="dxa"/>
+            <w:tcBorders>
+              <w:top w:val="single" w:sz="4" w:space="0" w:color="CCCCCC"/>
+              <w:left w:val="single" w:sz="4" w:space="0" w:color="CCCCCC"/>
+              <w:bottom w:val="single" w:sz="4" w:space="0" w:color="CCCCCC"/>
+              <w:right w:val="single" w:sz="4" w:space="0" w:color="CCCCCC"/>
+            </w:tcBorders>
+            <w:tcMar>
+              <w:top w:w="80" w:type="dxa"/>
+              <w:start w:w="120" w:type="dxa"/>
+              <w:bottom w:w="80" w:type="dxa"/>
+              <w:end w:w="120" w:type="dxa"/>
+            </w:tcMar>
+          </w:tcPr>
+          <w:p>
+            <w:r>
+              <w:t xml:space="preserve">MEDIUM</w:t>
+            </w:r>
+          </w:p>
+        </w:tc>
+        <w:tc>
+          <w:tcPr>
+            <w:tcW w:w="2200" w:type="dxa"/>
+            <w:tcBorders>
+              <w:top w:val="single" w:sz="4" w:space="0" w:color="CCCCCC"/>
+              <w:left w:val="single" w:sz="4" w:space="0" w:color="CCCCCC"/>
+              <w:bottom w:val="single" w:sz="4" w:space="0" w:color="CCCCCC"/>
+              <w:right w:val="single" w:sz="4" w:space="0" w:color="CCCCCC"/>
+            </w:tcBorders>
+            <w:tcMar>
+              <w:top w:w="80" w:type="dxa"/>
+              <w:start w:w="120" w:type="dxa"/>
+              <w:bottom w:w="80" w:type="dxa"/>
+              <w:end w:w="120" w:type="dxa"/>
+            </w:tcMar>
+          </w:tcPr>
+          <w:p>
+            <w:r>
+              <w:t xml:space="preserve">Accessible support formats</w:t>
+            </w:r>
+          </w:p>
+        </w:tc>
+        <w:tc>
+          <w:tcPr>
             <w:tcW w:w="1100" w:type="dxa"/>
-          </w:tcPr>
-          <w:p>
-            <w:pPr>
-              <w:pStyle w:val="Normal"/>
-            </w:pPr>
-            <w:r>
-              <w:t xml:space="preserve">MEDIUM</w:t>
-            </w:r>
-          </w:p>
-        </w:tc>
-        <w:tc>
-          <w:tcPr>
-            <w:tcW w:w="2900" w:type="dxa"/>
-          </w:tcPr>
-          <w:p>
-            <w:pPr>
-              <w:pStyle w:val="Normal"/>
-            </w:pPr>
-            <w:r>
-              <w:t xml:space="preserve">Accessible support formats</w:t>
-            </w:r>
-          </w:p>
-        </w:tc>
-        <w:tc>
-          <w:tcPr>
-            <w:tcW w:w="1134" w:type="dxa"/>
-          </w:tcPr>
-          <w:p>
-            <w:pPr>
-              <w:pStyle w:val="Normal"/>
-            </w:pPr>
+            <w:tcBorders>
+              <w:top w:val="single" w:sz="4" w:space="0" w:color="CCCCCC"/>
+              <w:left w:val="single" w:sz="4" w:space="0" w:color="CCCCCC"/>
+              <w:bottom w:val="single" w:sz="4" w:space="0" w:color="CCCCCC"/>
+              <w:right w:val="single" w:sz="4" w:space="0" w:color="CCCCCC"/>
+            </w:tcBorders>
+            <w:tcMar>
+              <w:top w:w="80" w:type="dxa"/>
+              <w:start w:w="120" w:type="dxa"/>
+              <w:bottom w:w="80" w:type="dxa"/>
+              <w:end w:w="120" w:type="dxa"/>
+            </w:tcMar>
+          </w:tcPr>
+          <w:p>
             <w:r>
               <w:t xml:space="preserve">F.2</w:t>
             </w:r>
@@ -2339,12 +3137,21 @@
         </w:tc>
         <w:tc>
           <w:tcPr>
-            <w:tcW w:w="4600" w:type="dxa"/>
-          </w:tcPr>
-          <w:p>
-            <w:pPr>
-              <w:pStyle w:val="Normal"/>
-            </w:pPr>
+            <w:tcW w:w="2400" w:type="dxa"/>
+            <w:tcBorders>
+              <w:top w:val="single" w:sz="4" w:space="0" w:color="CCCCCC"/>
+              <w:left w:val="single" w:sz="4" w:space="0" w:color="CCCCCC"/>
+              <w:bottom w:val="single" w:sz="4" w:space="0" w:color="CCCCCC"/>
+              <w:right w:val="single" w:sz="4" w:space="0" w:color="CCCCCC"/>
+            </w:tcBorders>
+            <w:tcMar>
+              <w:top w:w="80" w:type="dxa"/>
+              <w:start w:w="120" w:type="dxa"/>
+              <w:bottom w:w="80" w:type="dxa"/>
+              <w:end w:w="120" w:type="dxa"/>
+            </w:tcMar>
+          </w:tcPr>
+          <w:p>
             <w:r>
               <w:t xml:space="preserve">Expand support beyond phone + email (chat, text, video relay)</w:t>
             </w:r>
@@ -2362,40 +3169,50 @@
         <w:pStyle w:val="Heading1"/>
       </w:pPr>
       <w:r>
-        <w:t>Overall Compliance Status by Section</w:t>
+        <w:t xml:space="preserve">Overall Compliance Status by Section</w:t>
       </w:r>
     </w:p>
     <w:tbl>
       <w:tblPr>
-        <w:tblStyle w:val="TableGrid"/>
-        <w:tblW w:w="9734" w:type="dxa"/>
+        <w:tblW w:w="7200" w:type="dxa"/>
         <w:tblBorders>
-          <w:top w:val="single" w:sz="4" w:space="0" w:color="auto"/>
-          <w:left w:val="single" w:sz="4" w:space="0" w:color="auto"/>
-          <w:bottom w:val="single" w:sz="4" w:space="0" w:color="auto"/>
-          <w:right w:val="single" w:sz="4" w:space="0" w:color="auto"/>
-          <w:insideH w:val="single" w:sz="4" w:space="0" w:color="auto"/>
-          <w:insideV w:val="single" w:sz="4" w:space="0" w:color="auto"/>
+          <w:top w:val="single" w:sz="4" w:space="0" w:color="CCCCCC"/>
+          <w:left w:val="single" w:sz="4" w:space="0" w:color="CCCCCC"/>
+          <w:bottom w:val="single" w:sz="4" w:space="0" w:color="CCCCCC"/>
+          <w:right w:val="single" w:sz="4" w:space="0" w:color="CCCCCC"/>
         </w:tblBorders>
-        <w:tblLook w:val="04A0" w:firstRow="1" w:lastRow="0" w:firstColumn="1" w:lastColumn="0" w:noHBand="0" w:noVBand="1"/>
+        <w:tblCellMar>
+          <w:top w:w="80" w:type="dxa"/>
+          <w:start w:w="120" w:type="dxa"/>
+          <w:bottom w:w="80" w:type="dxa"/>
+          <w:end w:w="120" w:type="dxa"/>
+        </w:tblCellMar>
+        <w:tblLook w:val="04A0"/>
       </w:tblPr>
       <w:tblGrid>
-        <w:gridCol w:w="1600"/>
-        <w:gridCol w:w="5734"/>
-        <w:gridCol w:w="2400"/>
+        <w:gridCol w:w="1400"/>
+        <w:gridCol w:w="3800"/>
+        <w:gridCol w:w="2000"/>
       </w:tblGrid>
       <w:tr>
         <w:tc>
           <w:tcPr>
-            <w:tcW w:w="1600" w:type="dxa"/>
-          </w:tcPr>
-          <w:p>
-            <w:pPr>
-              <w:pStyle w:val="TableHeader"/>
-              <w:rPr>
-                <w:b/>
-              </w:rPr>
-            </w:pPr>
+            <w:tcW w:w="1400" w:type="dxa"/>
+            <w:tcBorders>
+              <w:top w:val="single" w:sz="4" w:space="0" w:color="CCCCCC"/>
+              <w:left w:val="single" w:sz="4" w:space="0" w:color="CCCCCC"/>
+              <w:bottom w:val="single" w:sz="4" w:space="0" w:color="CCCCCC"/>
+              <w:right w:val="single" w:sz="4" w:space="0" w:color="CCCCCC"/>
+            </w:tcBorders>
+            <w:shd w:val="clear" w:color="auto" w:fill="D5E8F0"/>
+            <w:tcMar>
+              <w:top w:w="80" w:type="dxa"/>
+              <w:start w:w="120" w:type="dxa"/>
+              <w:bottom w:w="80" w:type="dxa"/>
+              <w:end w:w="120" w:type="dxa"/>
+            </w:tcMar>
+          </w:tcPr>
+          <w:p>
             <w:r>
               <w:rPr>
                 <w:b/>
@@ -2406,15 +3223,22 @@
         </w:tc>
         <w:tc>
           <w:tcPr>
-            <w:tcW w:w="5734" w:type="dxa"/>
-          </w:tcPr>
-          <w:p>
-            <w:pPr>
-              <w:pStyle w:val="TableHeader"/>
-              <w:rPr>
-                <w:b/>
-              </w:rPr>
-            </w:pPr>
+            <w:tcW w:w="3800" w:type="dxa"/>
+            <w:tcBorders>
+              <w:top w:val="single" w:sz="4" w:space="0" w:color="CCCCCC"/>
+              <w:left w:val="single" w:sz="4" w:space="0" w:color="CCCCCC"/>
+              <w:bottom w:val="single" w:sz="4" w:space="0" w:color="CCCCCC"/>
+              <w:right w:val="single" w:sz="4" w:space="0" w:color="CCCCCC"/>
+            </w:tcBorders>
+            <w:shd w:val="clear" w:color="auto" w:fill="D5E8F0"/>
+            <w:tcMar>
+              <w:top w:w="80" w:type="dxa"/>
+              <w:start w:w="120" w:type="dxa"/>
+              <w:bottom w:w="80" w:type="dxa"/>
+              <w:end w:w="120" w:type="dxa"/>
+            </w:tcMar>
+          </w:tcPr>
+          <w:p>
             <w:r>
               <w:rPr>
                 <w:b/>
@@ -2425,15 +3249,22 @@
         </w:tc>
         <w:tc>
           <w:tcPr>
-            <w:tcW w:w="2400" w:type="dxa"/>
-          </w:tcPr>
-          <w:p>
-            <w:pPr>
-              <w:pStyle w:val="TableHeader"/>
-              <w:rPr>
-                <w:b/>
-              </w:rPr>
-            </w:pPr>
+            <w:tcW w:w="2000" w:type="dxa"/>
+            <w:tcBorders>
+              <w:top w:val="single" w:sz="4" w:space="0" w:color="CCCCCC"/>
+              <w:left w:val="single" w:sz="4" w:space="0" w:color="CCCCCC"/>
+              <w:bottom w:val="single" w:sz="4" w:space="0" w:color="CCCCCC"/>
+              <w:right w:val="single" w:sz="4" w:space="0" w:color="CCCCCC"/>
+            </w:tcBorders>
+            <w:shd w:val="clear" w:color="auto" w:fill="D5E8F0"/>
+            <w:tcMar>
+              <w:top w:w="80" w:type="dxa"/>
+              <w:start w:w="120" w:type="dxa"/>
+              <w:bottom w:w="80" w:type="dxa"/>
+              <w:end w:w="120" w:type="dxa"/>
+            </w:tcMar>
+          </w:tcPr>
+          <w:p>
             <w:r>
               <w:rPr>
                 <w:b/>
@@ -2446,12 +3277,21 @@
       <w:tr>
         <w:tc>
           <w:tcPr>
-            <w:tcW w:w="1600" w:type="dxa"/>
-          </w:tcPr>
-          <w:p>
-            <w:pPr>
-              <w:pStyle w:val="Normal"/>
-            </w:pPr>
+            <w:tcW w:w="1400" w:type="dxa"/>
+            <w:tcBorders>
+              <w:top w:val="single" w:sz="4" w:space="0" w:color="CCCCCC"/>
+              <w:left w:val="single" w:sz="4" w:space="0" w:color="CCCCCC"/>
+              <w:bottom w:val="single" w:sz="4" w:space="0" w:color="CCCCCC"/>
+              <w:right w:val="single" w:sz="4" w:space="0" w:color="CCCCCC"/>
+            </w:tcBorders>
+            <w:tcMar>
+              <w:top w:w="80" w:type="dxa"/>
+              <w:start w:w="120" w:type="dxa"/>
+              <w:bottom w:w="80" w:type="dxa"/>
+              <w:end w:w="120" w:type="dxa"/>
+            </w:tcMar>
+          </w:tcPr>
+          <w:p>
             <w:r>
               <w:t xml:space="preserve">A</w:t>
             </w:r>
@@ -2459,12 +3299,21 @@
         </w:tc>
         <w:tc>
           <w:tcPr>
-            <w:tcW w:w="5734" w:type="dxa"/>
-          </w:tcPr>
-          <w:p>
-            <w:pPr>
-              <w:pStyle w:val="Normal"/>
-            </w:pPr>
+            <w:tcW w:w="3800" w:type="dxa"/>
+            <w:tcBorders>
+              <w:top w:val="single" w:sz="4" w:space="0" w:color="CCCCCC"/>
+              <w:left w:val="single" w:sz="4" w:space="0" w:color="CCCCCC"/>
+              <w:bottom w:val="single" w:sz="4" w:space="0" w:color="CCCCCC"/>
+              <w:right w:val="single" w:sz="4" w:space="0" w:color="CCCCCC"/>
+            </w:tcBorders>
+            <w:tcMar>
+              <w:top w:w="80" w:type="dxa"/>
+              <w:start w:w="120" w:type="dxa"/>
+              <w:bottom w:w="80" w:type="dxa"/>
+              <w:end w:w="120" w:type="dxa"/>
+            </w:tcMar>
+          </w:tcPr>
+          <w:p>
             <w:r>
               <w:t xml:space="preserve">Product labelling and on-device markings</w:t>
             </w:r>
@@ -2472,12 +3321,21 @@
         </w:tc>
         <w:tc>
           <w:tcPr>
-            <w:tcW w:w="2400" w:type="dxa"/>
-          </w:tcPr>
-          <w:p>
-            <w:pPr>
-              <w:pStyle w:val="Normal"/>
-            </w:pPr>
+            <w:tcW w:w="2000" w:type="dxa"/>
+            <w:tcBorders>
+              <w:top w:val="single" w:sz="4" w:space="0" w:color="CCCCCC"/>
+              <w:left w:val="single" w:sz="4" w:space="0" w:color="CCCCCC"/>
+              <w:bottom w:val="single" w:sz="4" w:space="0" w:color="CCCCCC"/>
+              <w:right w:val="single" w:sz="4" w:space="0" w:color="CCCCCC"/>
+            </w:tcBorders>
+            <w:tcMar>
+              <w:top w:w="80" w:type="dxa"/>
+              <w:start w:w="120" w:type="dxa"/>
+              <w:bottom w:w="80" w:type="dxa"/>
+              <w:end w:w="120" w:type="dxa"/>
+            </w:tcMar>
+          </w:tcPr>
+          <w:p>
             <w:r>
               <w:t xml:space="preserve">CONFIRMED GAP</w:t>
             </w:r>
@@ -2487,12 +3345,21 @@
       <w:tr>
         <w:tc>
           <w:tcPr>
-            <w:tcW w:w="1600" w:type="dxa"/>
-          </w:tcPr>
-          <w:p>
-            <w:pPr>
-              <w:pStyle w:val="Normal"/>
-            </w:pPr>
+            <w:tcW w:w="1400" w:type="dxa"/>
+            <w:tcBorders>
+              <w:top w:val="single" w:sz="4" w:space="0" w:color="CCCCCC"/>
+              <w:left w:val="single" w:sz="4" w:space="0" w:color="CCCCCC"/>
+              <w:bottom w:val="single" w:sz="4" w:space="0" w:color="CCCCCC"/>
+              <w:right w:val="single" w:sz="4" w:space="0" w:color="CCCCCC"/>
+            </w:tcBorders>
+            <w:tcMar>
+              <w:top w:w="80" w:type="dxa"/>
+              <w:start w:w="120" w:type="dxa"/>
+              <w:bottom w:w="80" w:type="dxa"/>
+              <w:end w:w="120" w:type="dxa"/>
+            </w:tcMar>
+          </w:tcPr>
+          <w:p>
             <w:r>
               <w:t xml:space="preserve">B</w:t>
             </w:r>
@@ -2500,12 +3367,21 @@
         </w:tc>
         <w:tc>
           <w:tcPr>
-            <w:tcW w:w="5734" w:type="dxa"/>
-          </w:tcPr>
-          <w:p>
-            <w:pPr>
-              <w:pStyle w:val="Normal"/>
-            </w:pPr>
+            <w:tcW w:w="3800" w:type="dxa"/>
+            <w:tcBorders>
+              <w:top w:val="single" w:sz="4" w:space="0" w:color="CCCCCC"/>
+              <w:left w:val="single" w:sz="4" w:space="0" w:color="CCCCCC"/>
+              <w:bottom w:val="single" w:sz="4" w:space="0" w:color="CCCCCC"/>
+              <w:right w:val="single" w:sz="4" w:space="0" w:color="CCCCCC"/>
+            </w:tcBorders>
+            <w:tcMar>
+              <w:top w:w="80" w:type="dxa"/>
+              <w:start w:w="120" w:type="dxa"/>
+              <w:bottom w:w="80" w:type="dxa"/>
+              <w:end w:w="120" w:type="dxa"/>
+            </w:tcMar>
+          </w:tcPr>
+          <w:p>
             <w:r>
               <w:t xml:space="preserve">Documentation</w:t>
             </w:r>
@@ -2513,12 +3389,21 @@
         </w:tc>
         <w:tc>
           <w:tcPr>
-            <w:tcW w:w="2400" w:type="dxa"/>
-          </w:tcPr>
-          <w:p>
-            <w:pPr>
-              <w:pStyle w:val="Normal"/>
-            </w:pPr>
+            <w:tcW w:w="2000" w:type="dxa"/>
+            <w:tcBorders>
+              <w:top w:val="single" w:sz="4" w:space="0" w:color="CCCCCC"/>
+              <w:left w:val="single" w:sz="4" w:space="0" w:color="CCCCCC"/>
+              <w:bottom w:val="single" w:sz="4" w:space="0" w:color="CCCCCC"/>
+              <w:right w:val="single" w:sz="4" w:space="0" w:color="CCCCCC"/>
+            </w:tcBorders>
+            <w:tcMar>
+              <w:top w:w="80" w:type="dxa"/>
+              <w:start w:w="120" w:type="dxa"/>
+              <w:bottom w:w="80" w:type="dxa"/>
+              <w:end w:w="120" w:type="dxa"/>
+            </w:tcMar>
+          </w:tcPr>
+          <w:p>
             <w:r>
               <w:t xml:space="preserve">CONFIRMED GAP</w:t>
             </w:r>
@@ -2528,12 +3413,21 @@
       <w:tr>
         <w:tc>
           <w:tcPr>
-            <w:tcW w:w="1600" w:type="dxa"/>
-          </w:tcPr>
-          <w:p>
-            <w:pPr>
-              <w:pStyle w:val="Normal"/>
-            </w:pPr>
+            <w:tcW w:w="1400" w:type="dxa"/>
+            <w:tcBorders>
+              <w:top w:val="single" w:sz="4" w:space="0" w:color="CCCCCC"/>
+              <w:left w:val="single" w:sz="4" w:space="0" w:color="CCCCCC"/>
+              <w:bottom w:val="single" w:sz="4" w:space="0" w:color="CCCCCC"/>
+              <w:right w:val="single" w:sz="4" w:space="0" w:color="CCCCCC"/>
+            </w:tcBorders>
+            <w:tcMar>
+              <w:top w:w="80" w:type="dxa"/>
+              <w:start w:w="120" w:type="dxa"/>
+              <w:bottom w:w="80" w:type="dxa"/>
+              <w:end w:w="120" w:type="dxa"/>
+            </w:tcMar>
+          </w:tcPr>
+          <w:p>
             <w:r>
               <w:t xml:space="preserve">C</w:t>
             </w:r>
@@ -2541,12 +3435,21 @@
         </w:tc>
         <w:tc>
           <w:tcPr>
-            <w:tcW w:w="5734" w:type="dxa"/>
-          </w:tcPr>
-          <w:p>
-            <w:pPr>
-              <w:pStyle w:val="Normal"/>
-            </w:pPr>
+            <w:tcW w:w="3800" w:type="dxa"/>
+            <w:tcBorders>
+              <w:top w:val="single" w:sz="4" w:space="0" w:color="CCCCCC"/>
+              <w:left w:val="single" w:sz="4" w:space="0" w:color="CCCCCC"/>
+              <w:bottom w:val="single" w:sz="4" w:space="0" w:color="CCCCCC"/>
+              <w:right w:val="single" w:sz="4" w:space="0" w:color="CCCCCC"/>
+            </w:tcBorders>
+            <w:tcMar>
+              <w:top w:w="80" w:type="dxa"/>
+              <w:start w:w="120" w:type="dxa"/>
+              <w:bottom w:w="80" w:type="dxa"/>
+              <w:end w:w="120" w:type="dxa"/>
+            </w:tcMar>
+          </w:tcPr>
+          <w:p>
             <w:r>
               <w:t xml:space="preserve">Software / UI</w:t>
             </w:r>
@@ -2554,12 +3457,21 @@
         </w:tc>
         <w:tc>
           <w:tcPr>
-            <w:tcW w:w="2400" w:type="dxa"/>
-          </w:tcPr>
-          <w:p>
-            <w:pPr>
-              <w:pStyle w:val="Normal"/>
-            </w:pPr>
+            <w:tcW w:w="2000" w:type="dxa"/>
+            <w:tcBorders>
+              <w:top w:val="single" w:sz="4" w:space="0" w:color="CCCCCC"/>
+              <w:left w:val="single" w:sz="4" w:space="0" w:color="CCCCCC"/>
+              <w:bottom w:val="single" w:sz="4" w:space="0" w:color="CCCCCC"/>
+              <w:right w:val="single" w:sz="4" w:space="0" w:color="CCCCCC"/>
+            </w:tcBorders>
+            <w:tcMar>
+              <w:top w:w="80" w:type="dxa"/>
+              <w:start w:w="120" w:type="dxa"/>
+              <w:bottom w:w="80" w:type="dxa"/>
+              <w:end w:w="120" w:type="dxa"/>
+            </w:tcMar>
+          </w:tcPr>
+          <w:p>
             <w:r>
               <w:t xml:space="preserve">PARTIALLY MET (in progress)</w:t>
             </w:r>
@@ -2569,12 +3481,21 @@
       <w:tr>
         <w:tc>
           <w:tcPr>
-            <w:tcW w:w="1600" w:type="dxa"/>
-          </w:tcPr>
-          <w:p>
-            <w:pPr>
-              <w:pStyle w:val="Normal"/>
-            </w:pPr>
+            <w:tcW w:w="1400" w:type="dxa"/>
+            <w:tcBorders>
+              <w:top w:val="single" w:sz="4" w:space="0" w:color="CCCCCC"/>
+              <w:left w:val="single" w:sz="4" w:space="0" w:color="CCCCCC"/>
+              <w:bottom w:val="single" w:sz="4" w:space="0" w:color="CCCCCC"/>
+              <w:right w:val="single" w:sz="4" w:space="0" w:color="CCCCCC"/>
+            </w:tcBorders>
+            <w:tcMar>
+              <w:top w:w="80" w:type="dxa"/>
+              <w:start w:w="120" w:type="dxa"/>
+              <w:bottom w:w="80" w:type="dxa"/>
+              <w:end w:w="120" w:type="dxa"/>
+            </w:tcMar>
+          </w:tcPr>
+          <w:p>
             <w:r>
               <w:t xml:space="preserve">D</w:t>
             </w:r>
@@ -2582,12 +3503,21 @@
         </w:tc>
         <w:tc>
           <w:tcPr>
-            <w:tcW w:w="5734" w:type="dxa"/>
-          </w:tcPr>
-          <w:p>
-            <w:pPr>
-              <w:pStyle w:val="Normal"/>
-            </w:pPr>
+            <w:tcW w:w="3800" w:type="dxa"/>
+            <w:tcBorders>
+              <w:top w:val="single" w:sz="4" w:space="0" w:color="CCCCCC"/>
+              <w:left w:val="single" w:sz="4" w:space="0" w:color="CCCCCC"/>
+              <w:bottom w:val="single" w:sz="4" w:space="0" w:color="CCCCCC"/>
+              <w:right w:val="single" w:sz="4" w:space="0" w:color="CCCCCC"/>
+            </w:tcBorders>
+            <w:tcMar>
+              <w:top w:w="80" w:type="dxa"/>
+              <w:start w:w="120" w:type="dxa"/>
+              <w:bottom w:w="80" w:type="dxa"/>
+              <w:end w:w="120" w:type="dxa"/>
+            </w:tcMar>
+          </w:tcPr>
+          <w:p>
             <w:r>
               <w:t xml:space="preserve">Physical hardware design</w:t>
             </w:r>
@@ -2595,12 +3525,21 @@
         </w:tc>
         <w:tc>
           <w:tcPr>
-            <w:tcW w:w="2400" w:type="dxa"/>
-          </w:tcPr>
-          <w:p>
-            <w:pPr>
-              <w:pStyle w:val="Normal"/>
-            </w:pPr>
+            <w:tcW w:w="2000" w:type="dxa"/>
+            <w:tcBorders>
+              <w:top w:val="single" w:sz="4" w:space="0" w:color="CCCCCC"/>
+              <w:left w:val="single" w:sz="4" w:space="0" w:color="CCCCCC"/>
+              <w:bottom w:val="single" w:sz="4" w:space="0" w:color="CCCCCC"/>
+              <w:right w:val="single" w:sz="4" w:space="0" w:color="CCCCCC"/>
+            </w:tcBorders>
+            <w:tcMar>
+              <w:top w:w="80" w:type="dxa"/>
+              <w:start w:w="120" w:type="dxa"/>
+              <w:bottom w:w="80" w:type="dxa"/>
+              <w:end w:w="120" w:type="dxa"/>
+            </w:tcMar>
+          </w:tcPr>
+          <w:p>
             <w:r>
               <w:t xml:space="preserve">MET</w:t>
             </w:r>
@@ -2610,12 +3549,21 @@
       <w:tr>
         <w:tc>
           <w:tcPr>
-            <w:tcW w:w="1600" w:type="dxa"/>
-          </w:tcPr>
-          <w:p>
-            <w:pPr>
-              <w:pStyle w:val="Normal"/>
-            </w:pPr>
+            <w:tcW w:w="1400" w:type="dxa"/>
+            <w:tcBorders>
+              <w:top w:val="single" w:sz="4" w:space="0" w:color="CCCCCC"/>
+              <w:left w:val="single" w:sz="4" w:space="0" w:color="CCCCCC"/>
+              <w:bottom w:val="single" w:sz="4" w:space="0" w:color="CCCCCC"/>
+              <w:right w:val="single" w:sz="4" w:space="0" w:color="CCCCCC"/>
+            </w:tcBorders>
+            <w:tcMar>
+              <w:top w:w="80" w:type="dxa"/>
+              <w:start w:w="120" w:type="dxa"/>
+              <w:bottom w:w="80" w:type="dxa"/>
+              <w:end w:w="120" w:type="dxa"/>
+            </w:tcMar>
+          </w:tcPr>
+          <w:p>
             <w:r>
               <w:t xml:space="preserve">E</w:t>
             </w:r>
@@ -2623,12 +3571,21 @@
         </w:tc>
         <w:tc>
           <w:tcPr>
-            <w:tcW w:w="5734" w:type="dxa"/>
-          </w:tcPr>
-          <w:p>
-            <w:pPr>
-              <w:pStyle w:val="Normal"/>
-            </w:pPr>
+            <w:tcW w:w="3800" w:type="dxa"/>
+            <w:tcBorders>
+              <w:top w:val="single" w:sz="4" w:space="0" w:color="CCCCCC"/>
+              <w:left w:val="single" w:sz="4" w:space="0" w:color="CCCCCC"/>
+              <w:bottom w:val="single" w:sz="4" w:space="0" w:color="CCCCCC"/>
+              <w:right w:val="single" w:sz="4" w:space="0" w:color="CCCCCC"/>
+            </w:tcBorders>
+            <w:tcMar>
+              <w:top w:w="80" w:type="dxa"/>
+              <w:start w:w="120" w:type="dxa"/>
+              <w:bottom w:w="80" w:type="dxa"/>
+              <w:end w:w="120" w:type="dxa"/>
+            </w:tcMar>
+          </w:tcPr>
+          <w:p>
             <w:r>
               <w:t xml:space="preserve">Hearing technology / RF</w:t>
             </w:r>
@@ -2636,12 +3593,21 @@
         </w:tc>
         <w:tc>
           <w:tcPr>
-            <w:tcW w:w="2400" w:type="dxa"/>
-          </w:tcPr>
-          <w:p>
-            <w:pPr>
-              <w:pStyle w:val="Normal"/>
-            </w:pPr>
+            <w:tcW w:w="2000" w:type="dxa"/>
+            <w:tcBorders>
+              <w:top w:val="single" w:sz="4" w:space="0" w:color="CCCCCC"/>
+              <w:left w:val="single" w:sz="4" w:space="0" w:color="CCCCCC"/>
+              <w:bottom w:val="single" w:sz="4" w:space="0" w:color="CCCCCC"/>
+              <w:right w:val="single" w:sz="4" w:space="0" w:color="CCCCCC"/>
+            </w:tcBorders>
+            <w:tcMar>
+              <w:top w:w="80" w:type="dxa"/>
+              <w:start w:w="120" w:type="dxa"/>
+              <w:bottom w:w="80" w:type="dxa"/>
+              <w:end w:w="120" w:type="dxa"/>
+            </w:tcMar>
+          </w:tcPr>
+          <w:p>
             <w:r>
               <w:t xml:space="preserve">CONFIRMED GAP</w:t>
             </w:r>
@@ -2651,12 +3617,21 @@
       <w:tr>
         <w:tc>
           <w:tcPr>
-            <w:tcW w:w="1600" w:type="dxa"/>
-          </w:tcPr>
-          <w:p>
-            <w:pPr>
-              <w:pStyle w:val="Normal"/>
-            </w:pPr>
+            <w:tcW w:w="1400" w:type="dxa"/>
+            <w:tcBorders>
+              <w:top w:val="single" w:sz="4" w:space="0" w:color="CCCCCC"/>
+              <w:left w:val="single" w:sz="4" w:space="0" w:color="CCCCCC"/>
+              <w:bottom w:val="single" w:sz="4" w:space="0" w:color="CCCCCC"/>
+              <w:right w:val="single" w:sz="4" w:space="0" w:color="CCCCCC"/>
+            </w:tcBorders>
+            <w:tcMar>
+              <w:top w:w="80" w:type="dxa"/>
+              <w:start w:w="120" w:type="dxa"/>
+              <w:bottom w:w="80" w:type="dxa"/>
+              <w:end w:w="120" w:type="dxa"/>
+            </w:tcMar>
+          </w:tcPr>
+          <w:p>
             <w:r>
               <w:t xml:space="preserve">F</w:t>
             </w:r>
@@ -2664,12 +3639,21 @@
         </w:tc>
         <w:tc>
           <w:tcPr>
-            <w:tcW w:w="5734" w:type="dxa"/>
-          </w:tcPr>
-          <w:p>
-            <w:pPr>
-              <w:pStyle w:val="Normal"/>
-            </w:pPr>
+            <w:tcW w:w="3800" w:type="dxa"/>
+            <w:tcBorders>
+              <w:top w:val="single" w:sz="4" w:space="0" w:color="CCCCCC"/>
+              <w:left w:val="single" w:sz="4" w:space="0" w:color="CCCCCC"/>
+              <w:bottom w:val="single" w:sz="4" w:space="0" w:color="CCCCCC"/>
+              <w:right w:val="single" w:sz="4" w:space="0" w:color="CCCCCC"/>
+            </w:tcBorders>
+            <w:tcMar>
+              <w:top w:w="80" w:type="dxa"/>
+              <w:start w:w="120" w:type="dxa"/>
+              <w:bottom w:w="80" w:type="dxa"/>
+              <w:end w:w="120" w:type="dxa"/>
+            </w:tcMar>
+          </w:tcPr>
+          <w:p>
             <w:r>
               <w:t xml:space="preserve">Support services</w:t>
             </w:r>
@@ -2677,12 +3661,21 @@
         </w:tc>
         <w:tc>
           <w:tcPr>
-            <w:tcW w:w="2400" w:type="dxa"/>
-          </w:tcPr>
-          <w:p>
-            <w:pPr>
-              <w:pStyle w:val="Normal"/>
-            </w:pPr>
+            <w:tcW w:w="2000" w:type="dxa"/>
+            <w:tcBorders>
+              <w:top w:val="single" w:sz="4" w:space="0" w:color="CCCCCC"/>
+              <w:left w:val="single" w:sz="4" w:space="0" w:color="CCCCCC"/>
+              <w:bottom w:val="single" w:sz="4" w:space="0" w:color="CCCCCC"/>
+              <w:right w:val="single" w:sz="4" w:space="0" w:color="CCCCCC"/>
+            </w:tcBorders>
+            <w:tcMar>
+              <w:top w:w="80" w:type="dxa"/>
+              <w:start w:w="120" w:type="dxa"/>
+              <w:bottom w:w="80" w:type="dxa"/>
+              <w:end w:w="120" w:type="dxa"/>
+            </w:tcMar>
+          </w:tcPr>
+          <w:p>
             <w:r>
               <w:t xml:space="preserve">PARTIALLY MET</w:t>
             </w:r>
@@ -2692,12 +3685,21 @@
       <w:tr>
         <w:tc>
           <w:tcPr>
-            <w:tcW w:w="1600" w:type="dxa"/>
-          </w:tcPr>
-          <w:p>
-            <w:pPr>
-              <w:pStyle w:val="Normal"/>
-            </w:pPr>
+            <w:tcW w:w="1400" w:type="dxa"/>
+            <w:tcBorders>
+              <w:top w:val="single" w:sz="4" w:space="0" w:color="CCCCCC"/>
+              <w:left w:val="single" w:sz="4" w:space="0" w:color="CCCCCC"/>
+              <w:bottom w:val="single" w:sz="4" w:space="0" w:color="CCCCCC"/>
+              <w:right w:val="single" w:sz="4" w:space="0" w:color="CCCCCC"/>
+            </w:tcBorders>
+            <w:tcMar>
+              <w:top w:w="80" w:type="dxa"/>
+              <w:start w:w="120" w:type="dxa"/>
+              <w:bottom w:w="80" w:type="dxa"/>
+              <w:end w:w="120" w:type="dxa"/>
+            </w:tcMar>
+          </w:tcPr>
+          <w:p>
             <w:r>
               <w:t xml:space="preserve">G</w:t>
             </w:r>
@@ -2705,12 +3707,21 @@
         </w:tc>
         <w:tc>
           <w:tcPr>
-            <w:tcW w:w="5734" w:type="dxa"/>
-          </w:tcPr>
-          <w:p>
-            <w:pPr>
-              <w:pStyle w:val="Normal"/>
-            </w:pPr>
+            <w:tcW w:w="3800" w:type="dxa"/>
+            <w:tcBorders>
+              <w:top w:val="single" w:sz="4" w:space="0" w:color="CCCCCC"/>
+              <w:left w:val="single" w:sz="4" w:space="0" w:color="CCCCCC"/>
+              <w:bottom w:val="single" w:sz="4" w:space="0" w:color="CCCCCC"/>
+              <w:right w:val="single" w:sz="4" w:space="0" w:color="CCCCCC"/>
+            </w:tcBorders>
+            <w:tcMar>
+              <w:top w:w="80" w:type="dxa"/>
+              <w:start w:w="120" w:type="dxa"/>
+              <w:bottom w:w="80" w:type="dxa"/>
+              <w:end w:w="120" w:type="dxa"/>
+            </w:tcMar>
+          </w:tcPr>
+          <w:p>
             <w:r>
               <w:t xml:space="preserve">Packaging</w:t>
             </w:r>
@@ -2718,12 +3729,21 @@
         </w:tc>
         <w:tc>
           <w:tcPr>
-            <w:tcW w:w="2400" w:type="dxa"/>
-          </w:tcPr>
-          <w:p>
-            <w:pPr>
-              <w:pStyle w:val="Normal"/>
-            </w:pPr>
+            <w:tcW w:w="2000" w:type="dxa"/>
+            <w:tcBorders>
+              <w:top w:val="single" w:sz="4" w:space="0" w:color="CCCCCC"/>
+              <w:left w:val="single" w:sz="4" w:space="0" w:color="CCCCCC"/>
+              <w:bottom w:val="single" w:sz="4" w:space="0" w:color="CCCCCC"/>
+              <w:right w:val="single" w:sz="4" w:space="0" w:color="CCCCCC"/>
+            </w:tcBorders>
+            <w:tcMar>
+              <w:top w:w="80" w:type="dxa"/>
+              <w:start w:w="120" w:type="dxa"/>
+              <w:bottom w:w="80" w:type="dxa"/>
+              <w:end w:w="120" w:type="dxa"/>
+            </w:tcMar>
+          </w:tcPr>
+          <w:p>
             <w:r>
               <w:t xml:space="preserve">CONFIRMED GAP</w:t>
             </w:r>
@@ -2858,7 +3878,7 @@
                   <w:noProof/>
                   <w:lang w:val="en-US"/>
                 </w:rPr>
-                <w:t>April 2026</w:t>
+                <w:t>July 6, 2023</w:t>
               </w:r>
               <w:r>
                 <w:rPr>
@@ -3112,7 +4132,7 @@
             <w:rPr>
               <w:color w:val="A7A7A7" w:themeColor="background2"/>
             </w:rPr>
-            <w:t xml:space="preserve">SDG-8612 EAA Compliance: </w:t>
+            <w:t xml:space="preserve">SDG-8612 EAA Compliance | </w:t>
           </w:r>
           <w:r>
             <w:rPr>

</xml_diff>